<commit_message>
Add supplementary figures S1-S20, update DFT input path to paper/dft_inputs, regenerate SI docx
</commit_message>
<xml_diff>
--- a/paper/SI_v5.docx
+++ b/paper/SI_v5.docx
@@ -14017,17 +14017,116 @@
       </w:r>
     </w:p>
     <w:p>
+      <w:pPr>
+        <w:jc w:val="center"/>
+      </w:pPr>
+      <w:r>
+        <w:drawing>
+          <wp:inline xmlns:a="http://schemas.openxmlformats.org/drawingml/2006/main" xmlns:pic="http://schemas.openxmlformats.org/drawingml/2006/picture">
+            <wp:extent cx="5029200" cy="3352800"/>
+            <wp:docPr id="1" name="Picture 1"/>
+            <wp:cNvGraphicFramePr>
+              <a:graphicFrameLocks noChangeAspect="1"/>
+            </wp:cNvGraphicFramePr>
+            <a:graphic>
+              <a:graphicData uri="http://schemas.openxmlformats.org/drawingml/2006/picture">
+                <pic:pic>
+                  <pic:nvPicPr>
+                    <pic:cNvPr id="0" name="crystal_0742_bands.png"/>
+                    <pic:cNvPicPr/>
+                  </pic:nvPicPr>
+                  <pic:blipFill>
+                    <a:blip r:embed="rId9"/>
+                    <a:stretch>
+                      <a:fillRect/>
+                    </a:stretch>
+                  </pic:blipFill>
+                  <pic:spPr>
+                    <a:xfrm>
+                      <a:off x="0" y="0"/>
+                      <a:ext cx="5029200" cy="3352800"/>
+                    </a:xfrm>
+                    <a:prstGeom prst="rect"/>
+                  </pic:spPr>
+                </pic:pic>
+              </a:graphicData>
+            </a:graphic>
+          </wp:inline>
+        </w:drawing>
+      </w:r>
+    </w:p>
+    <w:p>
+      <w:pPr>
+        <w:jc w:val="center"/>
+      </w:pPr>
       <w:r>
         <w:rPr>
           <w:rFonts w:ascii="Times New Roman" w:hAnsi="Times New Roman" w:eastAsia="Times New Roman"/>
           <w:b w:val="0"/>
           <w:i/>
-          <w:color w:val="FF0000"/>
-          <w:sz w:val="22"/>
+          <w:sz w:val="20"/>
         </w:rPr>
-        <w:t>[Image not found: D:\virtual-element-hybrid-crystals\paper\figures_png\crystal_0742_bands.png]</w:t>
+        <w:t>Band distribution plot for crystal_0742 (NiH</w:t>
+      </w:r>
+      <w:r>
+        <w:rPr>
+          <w:rFonts w:ascii="Times New Roman" w:hAnsi="Times New Roman" w:eastAsia="Times New Roman"/>
+          <w:b w:val="0"/>
+          <w:i/>
+          <w:sz w:val="20"/>
+          <w:vertAlign w:val="subscript"/>
+        </w:rPr>
+        <w:t>8</w:t>
+      </w:r>
+      <w:r>
+        <w:rPr>
+          <w:rFonts w:ascii="Times New Roman" w:hAnsi="Times New Roman" w:eastAsia="Times New Roman"/>
+          <w:b w:val="0"/>
+          <w:i/>
+          <w:sz w:val="20"/>
+        </w:rPr>
+        <w:t>C</w:t>
+      </w:r>
+      <w:r>
+        <w:rPr>
+          <w:rFonts w:ascii="Times New Roman" w:hAnsi="Times New Roman" w:eastAsia="Times New Roman"/>
+          <w:b w:val="0"/>
+          <w:i/>
+          <w:sz w:val="20"/>
+          <w:vertAlign w:val="subscript"/>
+        </w:rPr>
+        <w:t>3</w:t>
+      </w:r>
+      <w:r>
+        <w:rPr>
+          <w:rFonts w:ascii="Times New Roman" w:hAnsi="Times New Roman" w:eastAsia="Times New Roman"/>
+          <w:b w:val="0"/>
+          <w:i/>
+          <w:sz w:val="20"/>
+        </w:rPr>
+        <w:t>I</w:t>
+      </w:r>
+      <w:r>
+        <w:rPr>
+          <w:rFonts w:ascii="Times New Roman" w:hAnsi="Times New Roman" w:eastAsia="Times New Roman"/>
+          <w:b w:val="0"/>
+          <w:i/>
+          <w:sz w:val="20"/>
+          <w:vertAlign w:val="subscript"/>
+        </w:rPr>
+        <w:t>3</w:t>
+      </w:r>
+      <w:r>
+        <w:rPr>
+          <w:rFonts w:ascii="Times New Roman" w:hAnsi="Times New Roman" w:eastAsia="Times New Roman"/>
+          <w:b w:val="0"/>
+          <w:i/>
+          <w:sz w:val="20"/>
+        </w:rPr>
+        <w:t>N). The blue points indicate fully occupied states (occ ≥ 0.99), red points indicate empty states (occ ≤ 0.01), and gray points indicate partially occupied states. The green dashed line marks the Fermi energy (1.880 eV). The band overlap at the Fermi level confirms metallic behavior. 112 k-points from a 4×4×4 grid are shown.</w:t>
       </w:r>
     </w:p>
+    <w:p/>
     <w:p>
       <w:pPr>
         <w:pStyle w:val="Heading3"/>
@@ -14044,17 +14143,116 @@
       </w:r>
     </w:p>
     <w:p>
+      <w:pPr>
+        <w:jc w:val="center"/>
+      </w:pPr>
+      <w:r>
+        <w:drawing>
+          <wp:inline xmlns:a="http://schemas.openxmlformats.org/drawingml/2006/main" xmlns:pic="http://schemas.openxmlformats.org/drawingml/2006/picture">
+            <wp:extent cx="5029200" cy="3017520"/>
+            <wp:docPr id="2" name="Picture 2"/>
+            <wp:cNvGraphicFramePr>
+              <a:graphicFrameLocks noChangeAspect="1"/>
+            </wp:cNvGraphicFramePr>
+            <a:graphic>
+              <a:graphicData uri="http://schemas.openxmlformats.org/drawingml/2006/picture">
+                <pic:pic>
+                  <pic:nvPicPr>
+                    <pic:cNvPr id="0" name="crystal_0742_dos.png"/>
+                    <pic:cNvPicPr/>
+                  </pic:nvPicPr>
+                  <pic:blipFill>
+                    <a:blip r:embed="rId10"/>
+                    <a:stretch>
+                      <a:fillRect/>
+                    </a:stretch>
+                  </pic:blipFill>
+                  <pic:spPr>
+                    <a:xfrm>
+                      <a:off x="0" y="0"/>
+                      <a:ext cx="5029200" cy="3017520"/>
+                    </a:xfrm>
+                    <a:prstGeom prst="rect"/>
+                  </pic:spPr>
+                </pic:pic>
+              </a:graphicData>
+            </a:graphic>
+          </wp:inline>
+        </w:drawing>
+      </w:r>
+    </w:p>
+    <w:p>
+      <w:pPr>
+        <w:jc w:val="center"/>
+      </w:pPr>
       <w:r>
         <w:rPr>
           <w:rFonts w:ascii="Times New Roman" w:hAnsi="Times New Roman" w:eastAsia="Times New Roman"/>
           <w:b w:val="0"/>
           <w:i/>
-          <w:color w:val="FF0000"/>
-          <w:sz w:val="22"/>
+          <w:sz w:val="20"/>
         </w:rPr>
-        <w:t>[Image not found: D:\virtual-element-hybrid-crystals\paper\figures_png\crystal_0742_dos.png]</w:t>
+        <w:t>Density of states (DOS) for crystal_0742 (NiH</w:t>
+      </w:r>
+      <w:r>
+        <w:rPr>
+          <w:rFonts w:ascii="Times New Roman" w:hAnsi="Times New Roman" w:eastAsia="Times New Roman"/>
+          <w:b w:val="0"/>
+          <w:i/>
+          <w:sz w:val="20"/>
+          <w:vertAlign w:val="subscript"/>
+        </w:rPr>
+        <w:t>8</w:t>
+      </w:r>
+      <w:r>
+        <w:rPr>
+          <w:rFonts w:ascii="Times New Roman" w:hAnsi="Times New Roman" w:eastAsia="Times New Roman"/>
+          <w:b w:val="0"/>
+          <w:i/>
+          <w:sz w:val="20"/>
+        </w:rPr>
+        <w:t>C</w:t>
+      </w:r>
+      <w:r>
+        <w:rPr>
+          <w:rFonts w:ascii="Times New Roman" w:hAnsi="Times New Roman" w:eastAsia="Times New Roman"/>
+          <w:b w:val="0"/>
+          <w:i/>
+          <w:sz w:val="20"/>
+          <w:vertAlign w:val="subscript"/>
+        </w:rPr>
+        <w:t>3</w:t>
+      </w:r>
+      <w:r>
+        <w:rPr>
+          <w:rFonts w:ascii="Times New Roman" w:hAnsi="Times New Roman" w:eastAsia="Times New Roman"/>
+          <w:b w:val="0"/>
+          <w:i/>
+          <w:sz w:val="20"/>
+        </w:rPr>
+        <w:t>I</w:t>
+      </w:r>
+      <w:r>
+        <w:rPr>
+          <w:rFonts w:ascii="Times New Roman" w:hAnsi="Times New Roman" w:eastAsia="Times New Roman"/>
+          <w:b w:val="0"/>
+          <w:i/>
+          <w:sz w:val="20"/>
+          <w:vertAlign w:val="subscript"/>
+        </w:rPr>
+        <w:t>3</w:t>
+      </w:r>
+      <w:r>
+        <w:rPr>
+          <w:rFonts w:ascii="Times New Roman" w:hAnsi="Times New Roman" w:eastAsia="Times New Roman"/>
+          <w:b w:val="0"/>
+          <w:i/>
+          <w:sz w:val="20"/>
+        </w:rPr>
+        <w:t>N). The Fermi energy is marked by a red dashed line. The finite DOS at the Fermi level confirms metallic character.</w:t>
       </w:r>
     </w:p>
+    <w:p/>
     <w:p>
       <w:pPr>
         <w:pStyle w:val="Heading3"/>
@@ -14071,17 +14269,116 @@
       </w:r>
     </w:p>
     <w:p>
+      <w:pPr>
+        <w:jc w:val="center"/>
+      </w:pPr>
+      <w:r>
+        <w:drawing>
+          <wp:inline xmlns:a="http://schemas.openxmlformats.org/drawingml/2006/main" xmlns:pic="http://schemas.openxmlformats.org/drawingml/2006/picture">
+            <wp:extent cx="5029200" cy="3352800"/>
+            <wp:docPr id="3" name="Picture 3"/>
+            <wp:cNvGraphicFramePr>
+              <a:graphicFrameLocks noChangeAspect="1"/>
+            </wp:cNvGraphicFramePr>
+            <a:graphic>
+              <a:graphicData uri="http://schemas.openxmlformats.org/drawingml/2006/picture">
+                <pic:pic>
+                  <pic:nvPicPr>
+                    <pic:cNvPr id="0" name="crystal_0789_bands.png"/>
+                    <pic:cNvPicPr/>
+                  </pic:nvPicPr>
+                  <pic:blipFill>
+                    <a:blip r:embed="rId11"/>
+                    <a:stretch>
+                      <a:fillRect/>
+                    </a:stretch>
+                  </pic:blipFill>
+                  <pic:spPr>
+                    <a:xfrm>
+                      <a:off x="0" y="0"/>
+                      <a:ext cx="5029200" cy="3352800"/>
+                    </a:xfrm>
+                    <a:prstGeom prst="rect"/>
+                  </pic:spPr>
+                </pic:pic>
+              </a:graphicData>
+            </a:graphic>
+          </wp:inline>
+        </w:drawing>
+      </w:r>
+    </w:p>
+    <w:p>
+      <w:pPr>
+        <w:jc w:val="center"/>
+      </w:pPr>
       <w:r>
         <w:rPr>
           <w:rFonts w:ascii="Times New Roman" w:hAnsi="Times New Roman" w:eastAsia="Times New Roman"/>
           <w:b w:val="0"/>
           <w:i/>
-          <w:color w:val="FF0000"/>
-          <w:sz w:val="22"/>
+          <w:sz w:val="20"/>
         </w:rPr>
-        <w:t>[Image not found: D:\virtual-element-hybrid-crystals\paper\figures_png\crystal_0789_bands.png]</w:t>
+        <w:t>Band distribution plot for crystal_0789 (NiH</w:t>
+      </w:r>
+      <w:r>
+        <w:rPr>
+          <w:rFonts w:ascii="Times New Roman" w:hAnsi="Times New Roman" w:eastAsia="Times New Roman"/>
+          <w:b w:val="0"/>
+          <w:i/>
+          <w:sz w:val="20"/>
+          <w:vertAlign w:val="subscript"/>
+        </w:rPr>
+        <w:t>8</w:t>
+      </w:r>
+      <w:r>
+        <w:rPr>
+          <w:rFonts w:ascii="Times New Roman" w:hAnsi="Times New Roman" w:eastAsia="Times New Roman"/>
+          <w:b w:val="0"/>
+          <w:i/>
+          <w:sz w:val="20"/>
+        </w:rPr>
+        <w:t>C</w:t>
+      </w:r>
+      <w:r>
+        <w:rPr>
+          <w:rFonts w:ascii="Times New Roman" w:hAnsi="Times New Roman" w:eastAsia="Times New Roman"/>
+          <w:b w:val="0"/>
+          <w:i/>
+          <w:sz w:val="20"/>
+          <w:vertAlign w:val="subscript"/>
+        </w:rPr>
+        <w:t>3</w:t>
+      </w:r>
+      <w:r>
+        <w:rPr>
+          <w:rFonts w:ascii="Times New Roman" w:hAnsi="Times New Roman" w:eastAsia="Times New Roman"/>
+          <w:b w:val="0"/>
+          <w:i/>
+          <w:sz w:val="20"/>
+        </w:rPr>
+        <w:t>I</w:t>
+      </w:r>
+      <w:r>
+        <w:rPr>
+          <w:rFonts w:ascii="Times New Roman" w:hAnsi="Times New Roman" w:eastAsia="Times New Roman"/>
+          <w:b w:val="0"/>
+          <w:i/>
+          <w:sz w:val="20"/>
+          <w:vertAlign w:val="subscript"/>
+        </w:rPr>
+        <w:t>3</w:t>
+      </w:r>
+      <w:r>
+        <w:rPr>
+          <w:rFonts w:ascii="Times New Roman" w:hAnsi="Times New Roman" w:eastAsia="Times New Roman"/>
+          <w:b w:val="0"/>
+          <w:i/>
+          <w:sz w:val="20"/>
+        </w:rPr>
+        <w:t>N). The blue points indicate fully occupied states, red points indicate empty states. The green dashed line marks the Fermi energy (3.416 eV). Metallic behavior is observed, similar to crystal_0742 but with a different Fermi level due to different lattice parameters.</w:t>
       </w:r>
     </w:p>
+    <w:p/>
     <w:p>
       <w:pPr>
         <w:pStyle w:val="Heading3"/>
@@ -14098,17 +14395,116 @@
       </w:r>
     </w:p>
     <w:p>
+      <w:pPr>
+        <w:jc w:val="center"/>
+      </w:pPr>
+      <w:r>
+        <w:drawing>
+          <wp:inline xmlns:a="http://schemas.openxmlformats.org/drawingml/2006/main" xmlns:pic="http://schemas.openxmlformats.org/drawingml/2006/picture">
+            <wp:extent cx="5029200" cy="3017520"/>
+            <wp:docPr id="4" name="Picture 4"/>
+            <wp:cNvGraphicFramePr>
+              <a:graphicFrameLocks noChangeAspect="1"/>
+            </wp:cNvGraphicFramePr>
+            <a:graphic>
+              <a:graphicData uri="http://schemas.openxmlformats.org/drawingml/2006/picture">
+                <pic:pic>
+                  <pic:nvPicPr>
+                    <pic:cNvPr id="0" name="crystal_0789_dos.png"/>
+                    <pic:cNvPicPr/>
+                  </pic:nvPicPr>
+                  <pic:blipFill>
+                    <a:blip r:embed="rId12"/>
+                    <a:stretch>
+                      <a:fillRect/>
+                    </a:stretch>
+                  </pic:blipFill>
+                  <pic:spPr>
+                    <a:xfrm>
+                      <a:off x="0" y="0"/>
+                      <a:ext cx="5029200" cy="3017520"/>
+                    </a:xfrm>
+                    <a:prstGeom prst="rect"/>
+                  </pic:spPr>
+                </pic:pic>
+              </a:graphicData>
+            </a:graphic>
+          </wp:inline>
+        </w:drawing>
+      </w:r>
+    </w:p>
+    <w:p>
+      <w:pPr>
+        <w:jc w:val="center"/>
+      </w:pPr>
       <w:r>
         <w:rPr>
           <w:rFonts w:ascii="Times New Roman" w:hAnsi="Times New Roman" w:eastAsia="Times New Roman"/>
           <w:b w:val="0"/>
           <w:i/>
-          <w:color w:val="FF0000"/>
-          <w:sz w:val="22"/>
+          <w:sz w:val="20"/>
         </w:rPr>
-        <w:t>[Image not found: D:\virtual-element-hybrid-crystals\paper\figures_png\crystal_0789_dos.png]</w:t>
+        <w:t>Density of states (DOS) for crystal_0789 (NiH</w:t>
+      </w:r>
+      <w:r>
+        <w:rPr>
+          <w:rFonts w:ascii="Times New Roman" w:hAnsi="Times New Roman" w:eastAsia="Times New Roman"/>
+          <w:b w:val="0"/>
+          <w:i/>
+          <w:sz w:val="20"/>
+          <w:vertAlign w:val="subscript"/>
+        </w:rPr>
+        <w:t>8</w:t>
+      </w:r>
+      <w:r>
+        <w:rPr>
+          <w:rFonts w:ascii="Times New Roman" w:hAnsi="Times New Roman" w:eastAsia="Times New Roman"/>
+          <w:b w:val="0"/>
+          <w:i/>
+          <w:sz w:val="20"/>
+        </w:rPr>
+        <w:t>C</w:t>
+      </w:r>
+      <w:r>
+        <w:rPr>
+          <w:rFonts w:ascii="Times New Roman" w:hAnsi="Times New Roman" w:eastAsia="Times New Roman"/>
+          <w:b w:val="0"/>
+          <w:i/>
+          <w:sz w:val="20"/>
+          <w:vertAlign w:val="subscript"/>
+        </w:rPr>
+        <w:t>3</w:t>
+      </w:r>
+      <w:r>
+        <w:rPr>
+          <w:rFonts w:ascii="Times New Roman" w:hAnsi="Times New Roman" w:eastAsia="Times New Roman"/>
+          <w:b w:val="0"/>
+          <w:i/>
+          <w:sz w:val="20"/>
+        </w:rPr>
+        <w:t>I</w:t>
+      </w:r>
+      <w:r>
+        <w:rPr>
+          <w:rFonts w:ascii="Times New Roman" w:hAnsi="Times New Roman" w:eastAsia="Times New Roman"/>
+          <w:b w:val="0"/>
+          <w:i/>
+          <w:sz w:val="20"/>
+          <w:vertAlign w:val="subscript"/>
+        </w:rPr>
+        <w:t>3</w:t>
+      </w:r>
+      <w:r>
+        <w:rPr>
+          <w:rFonts w:ascii="Times New Roman" w:hAnsi="Times New Roman" w:eastAsia="Times New Roman"/>
+          <w:b w:val="0"/>
+          <w:i/>
+          <w:sz w:val="20"/>
+        </w:rPr>
+        <w:t>N).</w:t>
       </w:r>
     </w:p>
+    <w:p/>
     <w:p>
       <w:pPr>
         <w:pStyle w:val="Heading3"/>
@@ -14125,17 +14521,154 @@
       </w:r>
     </w:p>
     <w:p>
+      <w:pPr>
+        <w:jc w:val="center"/>
+      </w:pPr>
+      <w:r>
+        <w:drawing>
+          <wp:inline xmlns:a="http://schemas.openxmlformats.org/drawingml/2006/main" xmlns:pic="http://schemas.openxmlformats.org/drawingml/2006/picture">
+            <wp:extent cx="5029200" cy="3352800"/>
+            <wp:docPr id="5" name="Picture 5"/>
+            <wp:cNvGraphicFramePr>
+              <a:graphicFrameLocks noChangeAspect="1"/>
+            </wp:cNvGraphicFramePr>
+            <a:graphic>
+              <a:graphicData uri="http://schemas.openxmlformats.org/drawingml/2006/picture">
+                <pic:pic>
+                  <pic:nvPicPr>
+                    <pic:cNvPr id="0" name="crystal_0391_bands.png"/>
+                    <pic:cNvPicPr/>
+                  </pic:nvPicPr>
+                  <pic:blipFill>
+                    <a:blip r:embed="rId13"/>
+                    <a:stretch>
+                      <a:fillRect/>
+                    </a:stretch>
+                  </pic:blipFill>
+                  <pic:spPr>
+                    <a:xfrm>
+                      <a:off x="0" y="0"/>
+                      <a:ext cx="5029200" cy="3352800"/>
+                    </a:xfrm>
+                    <a:prstGeom prst="rect"/>
+                  </pic:spPr>
+                </pic:pic>
+              </a:graphicData>
+            </a:graphic>
+          </wp:inline>
+        </w:drawing>
+      </w:r>
+    </w:p>
+    <w:p>
+      <w:pPr>
+        <w:jc w:val="center"/>
+      </w:pPr>
       <w:r>
         <w:rPr>
           <w:rFonts w:ascii="Times New Roman" w:hAnsi="Times New Roman" w:eastAsia="Times New Roman"/>
           <w:b w:val="0"/>
           <w:i/>
-          <w:color w:val="FF0000"/>
-          <w:sz w:val="22"/>
+          <w:sz w:val="20"/>
         </w:rPr>
-        <w:t>[Image not found: D:\virtual-element-hybrid-crystals\paper\figures_png\crystal_0391_bands.png]</w:t>
+        <w:t>Band distribution plot for crystal_0391 (Mg</w:t>
+      </w:r>
+      <w:r>
+        <w:rPr>
+          <w:rFonts w:ascii="Times New Roman" w:hAnsi="Times New Roman" w:eastAsia="Times New Roman"/>
+          <w:b w:val="0"/>
+          <w:i/>
+          <w:sz w:val="20"/>
+          <w:vertAlign w:val="subscript"/>
+        </w:rPr>
+        <w:t>2</w:t>
+      </w:r>
+      <w:r>
+        <w:rPr>
+          <w:rFonts w:ascii="Times New Roman" w:hAnsi="Times New Roman" w:eastAsia="Times New Roman"/>
+          <w:b w:val="0"/>
+          <w:i/>
+          <w:sz w:val="20"/>
+        </w:rPr>
+        <w:t>H</w:t>
+      </w:r>
+      <w:r>
+        <w:rPr>
+          <w:rFonts w:ascii="Times New Roman" w:hAnsi="Times New Roman" w:eastAsia="Times New Roman"/>
+          <w:b w:val="0"/>
+          <w:i/>
+          <w:sz w:val="20"/>
+          <w:vertAlign w:val="subscript"/>
+        </w:rPr>
+        <w:t>12</w:t>
+      </w:r>
+      <w:r>
+        <w:rPr>
+          <w:rFonts w:ascii="Times New Roman" w:hAnsi="Times New Roman" w:eastAsia="Times New Roman"/>
+          <w:b w:val="0"/>
+          <w:i/>
+          <w:sz w:val="20"/>
+        </w:rPr>
+        <w:t>C</w:t>
+      </w:r>
+      <w:r>
+        <w:rPr>
+          <w:rFonts w:ascii="Times New Roman" w:hAnsi="Times New Roman" w:eastAsia="Times New Roman"/>
+          <w:b w:val="0"/>
+          <w:i/>
+          <w:sz w:val="20"/>
+          <w:vertAlign w:val="subscript"/>
+        </w:rPr>
+        <w:t>2</w:t>
+      </w:r>
+      <w:r>
+        <w:rPr>
+          <w:rFonts w:ascii="Times New Roman" w:hAnsi="Times New Roman" w:eastAsia="Times New Roman"/>
+          <w:b w:val="0"/>
+          <w:i/>
+          <w:sz w:val="20"/>
+        </w:rPr>
+        <w:t>I</w:t>
+      </w:r>
+      <w:r>
+        <w:rPr>
+          <w:rFonts w:ascii="Times New Roman" w:hAnsi="Times New Roman" w:eastAsia="Times New Roman"/>
+          <w:b w:val="0"/>
+          <w:i/>
+          <w:sz w:val="20"/>
+          <w:vertAlign w:val="subscript"/>
+        </w:rPr>
+        <w:t>6</w:t>
+      </w:r>
+      <w:r>
+        <w:rPr>
+          <w:rFonts w:ascii="Times New Roman" w:hAnsi="Times New Roman" w:eastAsia="Times New Roman"/>
+          <w:b w:val="0"/>
+          <w:i/>
+          <w:sz w:val="20"/>
+        </w:rPr>
+        <w:t>N</w:t>
+      </w:r>
+      <w:r>
+        <w:rPr>
+          <w:rFonts w:ascii="Times New Roman" w:hAnsi="Times New Roman" w:eastAsia="Times New Roman"/>
+          <w:b w:val="0"/>
+          <w:i/>
+          <w:sz w:val="20"/>
+          <w:vertAlign w:val="subscript"/>
+        </w:rPr>
+        <w:t>2</w:t>
+      </w:r>
+      <w:r>
+        <w:rPr>
+          <w:rFonts w:ascii="Times New Roman" w:hAnsi="Times New Roman" w:eastAsia="Times New Roman"/>
+          <w:b w:val="0"/>
+          <w:i/>
+          <w:sz w:val="20"/>
+        </w:rPr>
+        <w:t>). The green dashed line marks the Fermi energy (1.856 eV). The structure shows metallic behavior with band overlap at the Fermi level. Note: a non-physical Mg–C distance of 1.27 Å may contribute to the artificial metallic character.</w:t>
       </w:r>
     </w:p>
+    <w:p/>
     <w:p>
       <w:pPr>
         <w:pStyle w:val="Heading3"/>
@@ -14152,17 +14685,154 @@
       </w:r>
     </w:p>
     <w:p>
+      <w:pPr>
+        <w:jc w:val="center"/>
+      </w:pPr>
+      <w:r>
+        <w:drawing>
+          <wp:inline xmlns:a="http://schemas.openxmlformats.org/drawingml/2006/main" xmlns:pic="http://schemas.openxmlformats.org/drawingml/2006/picture">
+            <wp:extent cx="5029200" cy="3017520"/>
+            <wp:docPr id="6" name="Picture 6"/>
+            <wp:cNvGraphicFramePr>
+              <a:graphicFrameLocks noChangeAspect="1"/>
+            </wp:cNvGraphicFramePr>
+            <a:graphic>
+              <a:graphicData uri="http://schemas.openxmlformats.org/drawingml/2006/picture">
+                <pic:pic>
+                  <pic:nvPicPr>
+                    <pic:cNvPr id="0" name="crystal_0391_dos.png"/>
+                    <pic:cNvPicPr/>
+                  </pic:nvPicPr>
+                  <pic:blipFill>
+                    <a:blip r:embed="rId14"/>
+                    <a:stretch>
+                      <a:fillRect/>
+                    </a:stretch>
+                  </pic:blipFill>
+                  <pic:spPr>
+                    <a:xfrm>
+                      <a:off x="0" y="0"/>
+                      <a:ext cx="5029200" cy="3017520"/>
+                    </a:xfrm>
+                    <a:prstGeom prst="rect"/>
+                  </pic:spPr>
+                </pic:pic>
+              </a:graphicData>
+            </a:graphic>
+          </wp:inline>
+        </w:drawing>
+      </w:r>
+    </w:p>
+    <w:p>
+      <w:pPr>
+        <w:jc w:val="center"/>
+      </w:pPr>
       <w:r>
         <w:rPr>
           <w:rFonts w:ascii="Times New Roman" w:hAnsi="Times New Roman" w:eastAsia="Times New Roman"/>
           <w:b w:val="0"/>
           <w:i/>
-          <w:color w:val="FF0000"/>
-          <w:sz w:val="22"/>
+          <w:sz w:val="20"/>
         </w:rPr>
-        <w:t>[Image not found: D:\virtual-element-hybrid-crystals\paper\figures_png\crystal_0391_dos.png]</w:t>
+        <w:t>Density of states (DOS) for crystal_0391 (Mg</w:t>
+      </w:r>
+      <w:r>
+        <w:rPr>
+          <w:rFonts w:ascii="Times New Roman" w:hAnsi="Times New Roman" w:eastAsia="Times New Roman"/>
+          <w:b w:val="0"/>
+          <w:i/>
+          <w:sz w:val="20"/>
+          <w:vertAlign w:val="subscript"/>
+        </w:rPr>
+        <w:t>2</w:t>
+      </w:r>
+      <w:r>
+        <w:rPr>
+          <w:rFonts w:ascii="Times New Roman" w:hAnsi="Times New Roman" w:eastAsia="Times New Roman"/>
+          <w:b w:val="0"/>
+          <w:i/>
+          <w:sz w:val="20"/>
+        </w:rPr>
+        <w:t>H</w:t>
+      </w:r>
+      <w:r>
+        <w:rPr>
+          <w:rFonts w:ascii="Times New Roman" w:hAnsi="Times New Roman" w:eastAsia="Times New Roman"/>
+          <w:b w:val="0"/>
+          <w:i/>
+          <w:sz w:val="20"/>
+          <w:vertAlign w:val="subscript"/>
+        </w:rPr>
+        <w:t>12</w:t>
+      </w:r>
+      <w:r>
+        <w:rPr>
+          <w:rFonts w:ascii="Times New Roman" w:hAnsi="Times New Roman" w:eastAsia="Times New Roman"/>
+          <w:b w:val="0"/>
+          <w:i/>
+          <w:sz w:val="20"/>
+        </w:rPr>
+        <w:t>C</w:t>
+      </w:r>
+      <w:r>
+        <w:rPr>
+          <w:rFonts w:ascii="Times New Roman" w:hAnsi="Times New Roman" w:eastAsia="Times New Roman"/>
+          <w:b w:val="0"/>
+          <w:i/>
+          <w:sz w:val="20"/>
+          <w:vertAlign w:val="subscript"/>
+        </w:rPr>
+        <w:t>2</w:t>
+      </w:r>
+      <w:r>
+        <w:rPr>
+          <w:rFonts w:ascii="Times New Roman" w:hAnsi="Times New Roman" w:eastAsia="Times New Roman"/>
+          <w:b w:val="0"/>
+          <w:i/>
+          <w:sz w:val="20"/>
+        </w:rPr>
+        <w:t>I</w:t>
+      </w:r>
+      <w:r>
+        <w:rPr>
+          <w:rFonts w:ascii="Times New Roman" w:hAnsi="Times New Roman" w:eastAsia="Times New Roman"/>
+          <w:b w:val="0"/>
+          <w:i/>
+          <w:sz w:val="20"/>
+          <w:vertAlign w:val="subscript"/>
+        </w:rPr>
+        <w:t>6</w:t>
+      </w:r>
+      <w:r>
+        <w:rPr>
+          <w:rFonts w:ascii="Times New Roman" w:hAnsi="Times New Roman" w:eastAsia="Times New Roman"/>
+          <w:b w:val="0"/>
+          <w:i/>
+          <w:sz w:val="20"/>
+        </w:rPr>
+        <w:t>N</w:t>
+      </w:r>
+      <w:r>
+        <w:rPr>
+          <w:rFonts w:ascii="Times New Roman" w:hAnsi="Times New Roman" w:eastAsia="Times New Roman"/>
+          <w:b w:val="0"/>
+          <w:i/>
+          <w:sz w:val="20"/>
+          <w:vertAlign w:val="subscript"/>
+        </w:rPr>
+        <w:t>2</w:t>
+      </w:r>
+      <w:r>
+        <w:rPr>
+          <w:rFonts w:ascii="Times New Roman" w:hAnsi="Times New Roman" w:eastAsia="Times New Roman"/>
+          <w:b w:val="0"/>
+          <w:i/>
+          <w:sz w:val="20"/>
+        </w:rPr>
+        <w:t>).</w:t>
       </w:r>
     </w:p>
+    <w:p/>
     <w:p>
       <w:pPr>
         <w:pStyle w:val="Heading3"/>
@@ -14179,17 +14849,97 @@
       </w:r>
     </w:p>
     <w:p>
+      <w:pPr>
+        <w:jc w:val="center"/>
+      </w:pPr>
+      <w:r>
+        <w:drawing>
+          <wp:inline xmlns:a="http://schemas.openxmlformats.org/drawingml/2006/main" xmlns:pic="http://schemas.openxmlformats.org/drawingml/2006/picture">
+            <wp:extent cx="5029200" cy="3352800"/>
+            <wp:docPr id="7" name="Picture 7"/>
+            <wp:cNvGraphicFramePr>
+              <a:graphicFrameLocks noChangeAspect="1"/>
+            </wp:cNvGraphicFramePr>
+            <a:graphic>
+              <a:graphicData uri="http://schemas.openxmlformats.org/drawingml/2006/picture">
+                <pic:pic>
+                  <pic:nvPicPr>
+                    <pic:cNvPr id="0" name="crystal_0631_bands.png"/>
+                    <pic:cNvPicPr/>
+                  </pic:nvPicPr>
+                  <pic:blipFill>
+                    <a:blip r:embed="rId15"/>
+                    <a:stretch>
+                      <a:fillRect/>
+                    </a:stretch>
+                  </pic:blipFill>
+                  <pic:spPr>
+                    <a:xfrm>
+                      <a:off x="0" y="0"/>
+                      <a:ext cx="5029200" cy="3352800"/>
+                    </a:xfrm>
+                    <a:prstGeom prst="rect"/>
+                  </pic:spPr>
+                </pic:pic>
+              </a:graphicData>
+            </a:graphic>
+          </wp:inline>
+        </w:drawing>
+      </w:r>
+    </w:p>
+    <w:p>
+      <w:pPr>
+        <w:jc w:val="center"/>
+      </w:pPr>
       <w:r>
         <w:rPr>
           <w:rFonts w:ascii="Times New Roman" w:hAnsi="Times New Roman" w:eastAsia="Times New Roman"/>
           <w:b w:val="0"/>
           <w:i/>
-          <w:color w:val="FF0000"/>
-          <w:sz w:val="22"/>
+          <w:sz w:val="20"/>
         </w:rPr>
-        <w:t>[Image not found: D:\virtual-element-hybrid-crystals\paper\figures_png\crystal_0631_bands.png]</w:t>
+        <w:t>Band distribution plot for crystal_0631 (CsH</w:t>
+      </w:r>
+      <w:r>
+        <w:rPr>
+          <w:rFonts w:ascii="Times New Roman" w:hAnsi="Times New Roman" w:eastAsia="Times New Roman"/>
+          <w:b w:val="0"/>
+          <w:i/>
+          <w:sz w:val="20"/>
+          <w:vertAlign w:val="subscript"/>
+        </w:rPr>
+        <w:t>6</w:t>
+      </w:r>
+      <w:r>
+        <w:rPr>
+          <w:rFonts w:ascii="Times New Roman" w:hAnsi="Times New Roman" w:eastAsia="Times New Roman"/>
+          <w:b w:val="0"/>
+          <w:i/>
+          <w:sz w:val="20"/>
+        </w:rPr>
+        <w:t>CBr</w:t>
+      </w:r>
+      <w:r>
+        <w:rPr>
+          <w:rFonts w:ascii="Times New Roman" w:hAnsi="Times New Roman" w:eastAsia="Times New Roman"/>
+          <w:b w:val="0"/>
+          <w:i/>
+          <w:sz w:val="20"/>
+          <w:vertAlign w:val="subscript"/>
+        </w:rPr>
+        <w:t>2</w:t>
+      </w:r>
+      <w:r>
+        <w:rPr>
+          <w:rFonts w:ascii="Times New Roman" w:hAnsi="Times New Roman" w:eastAsia="Times New Roman"/>
+          <w:b w:val="0"/>
+          <w:i/>
+          <w:sz w:val="20"/>
+        </w:rPr>
+        <w:t>N). The blue points indicate occupied states, red points indicate empty states. The green dashed line marks the Fermi energy (0.525 eV). The blue dashed line marks the VBM (−1.010 eV, k-index 18) and the red dashed line marks the CBM (1.162 eV, k-index 0, Gamma point). The clear separation between occupied and empty states confirms semiconducting behavior with an indirect band gap of 2.17 eV.</w:t>
       </w:r>
     </w:p>
+    <w:p/>
     <w:p>
       <w:pPr>
         <w:pStyle w:val="Heading3"/>
@@ -14206,17 +14956,97 @@
       </w:r>
     </w:p>
     <w:p>
+      <w:pPr>
+        <w:jc w:val="center"/>
+      </w:pPr>
+      <w:r>
+        <w:drawing>
+          <wp:inline xmlns:a="http://schemas.openxmlformats.org/drawingml/2006/main" xmlns:pic="http://schemas.openxmlformats.org/drawingml/2006/picture">
+            <wp:extent cx="5029200" cy="3017520"/>
+            <wp:docPr id="8" name="Picture 8"/>
+            <wp:cNvGraphicFramePr>
+              <a:graphicFrameLocks noChangeAspect="1"/>
+            </wp:cNvGraphicFramePr>
+            <a:graphic>
+              <a:graphicData uri="http://schemas.openxmlformats.org/drawingml/2006/picture">
+                <pic:pic>
+                  <pic:nvPicPr>
+                    <pic:cNvPr id="0" name="crystal_0631_dos.png"/>
+                    <pic:cNvPicPr/>
+                  </pic:nvPicPr>
+                  <pic:blipFill>
+                    <a:blip r:embed="rId16"/>
+                    <a:stretch>
+                      <a:fillRect/>
+                    </a:stretch>
+                  </pic:blipFill>
+                  <pic:spPr>
+                    <a:xfrm>
+                      <a:off x="0" y="0"/>
+                      <a:ext cx="5029200" cy="3017520"/>
+                    </a:xfrm>
+                    <a:prstGeom prst="rect"/>
+                  </pic:spPr>
+                </pic:pic>
+              </a:graphicData>
+            </a:graphic>
+          </wp:inline>
+        </w:drawing>
+      </w:r>
+    </w:p>
+    <w:p>
+      <w:pPr>
+        <w:jc w:val="center"/>
+      </w:pPr>
       <w:r>
         <w:rPr>
           <w:rFonts w:ascii="Times New Roman" w:hAnsi="Times New Roman" w:eastAsia="Times New Roman"/>
           <w:b w:val="0"/>
           <w:i/>
-          <w:color w:val="FF0000"/>
-          <w:sz w:val="22"/>
+          <w:sz w:val="20"/>
         </w:rPr>
-        <w:t>[Image not found: D:\virtual-element-hybrid-crystals\paper\figures_png\crystal_0631_dos.png]</w:t>
+        <w:t>Density of states (DOS) for crystal_0631 (CsH</w:t>
+      </w:r>
+      <w:r>
+        <w:rPr>
+          <w:rFonts w:ascii="Times New Roman" w:hAnsi="Times New Roman" w:eastAsia="Times New Roman"/>
+          <w:b w:val="0"/>
+          <w:i/>
+          <w:sz w:val="20"/>
+          <w:vertAlign w:val="subscript"/>
+        </w:rPr>
+        <w:t>6</w:t>
+      </w:r>
+      <w:r>
+        <w:rPr>
+          <w:rFonts w:ascii="Times New Roman" w:hAnsi="Times New Roman" w:eastAsia="Times New Roman"/>
+          <w:b w:val="0"/>
+          <w:i/>
+          <w:sz w:val="20"/>
+        </w:rPr>
+        <w:t>CBr</w:t>
+      </w:r>
+      <w:r>
+        <w:rPr>
+          <w:rFonts w:ascii="Times New Roman" w:hAnsi="Times New Roman" w:eastAsia="Times New Roman"/>
+          <w:b w:val="0"/>
+          <w:i/>
+          <w:sz w:val="20"/>
+          <w:vertAlign w:val="subscript"/>
+        </w:rPr>
+        <w:t>2</w:t>
+      </w:r>
+      <w:r>
+        <w:rPr>
+          <w:rFonts w:ascii="Times New Roman" w:hAnsi="Times New Roman" w:eastAsia="Times New Roman"/>
+          <w:b w:val="0"/>
+          <w:i/>
+          <w:sz w:val="20"/>
+        </w:rPr>
+        <w:t>N). The Fermi energy lies in the gap, consistent with semiconducting behavior. The DOS peak at ~1 eV corresponds to Br 4p states.</w:t>
       </w:r>
     </w:p>
+    <w:p/>
     <w:p>
       <w:pPr>
         <w:pStyle w:val="Heading3"/>
@@ -14233,17 +15063,116 @@
       </w:r>
     </w:p>
     <w:p>
+      <w:pPr>
+        <w:jc w:val="center"/>
+      </w:pPr>
+      <w:r>
+        <w:drawing>
+          <wp:inline xmlns:a="http://schemas.openxmlformats.org/drawingml/2006/main" xmlns:pic="http://schemas.openxmlformats.org/drawingml/2006/picture">
+            <wp:extent cx="5029200" cy="3352800"/>
+            <wp:docPr id="9" name="Picture 9"/>
+            <wp:cNvGraphicFramePr>
+              <a:graphicFrameLocks noChangeAspect="1"/>
+            </wp:cNvGraphicFramePr>
+            <a:graphic>
+              <a:graphicData uri="http://schemas.openxmlformats.org/drawingml/2006/picture">
+                <pic:pic>
+                  <pic:nvPicPr>
+                    <pic:cNvPr id="0" name="crystal_0912_bands.png"/>
+                    <pic:cNvPicPr/>
+                  </pic:nvPicPr>
+                  <pic:blipFill>
+                    <a:blip r:embed="rId17"/>
+                    <a:stretch>
+                      <a:fillRect/>
+                    </a:stretch>
+                  </pic:blipFill>
+                  <pic:spPr>
+                    <a:xfrm>
+                      <a:off x="0" y="0"/>
+                      <a:ext cx="5029200" cy="3352800"/>
+                    </a:xfrm>
+                    <a:prstGeom prst="rect"/>
+                  </pic:spPr>
+                </pic:pic>
+              </a:graphicData>
+            </a:graphic>
+          </wp:inline>
+        </w:drawing>
+      </w:r>
+    </w:p>
+    <w:p>
+      <w:pPr>
+        <w:jc w:val="center"/>
+      </w:pPr>
       <w:r>
         <w:rPr>
           <w:rFonts w:ascii="Times New Roman" w:hAnsi="Times New Roman" w:eastAsia="Times New Roman"/>
           <w:b w:val="0"/>
           <w:i/>
-          <w:color w:val="FF0000"/>
-          <w:sz w:val="22"/>
+          <w:sz w:val="20"/>
         </w:rPr>
-        <w:t>[Image not found: D:\virtual-element-hybrid-crystals\paper\figures_png\crystal_0912_bands.png]</w:t>
+        <w:t>Band distribution plot for crystal_0912 (KH</w:t>
+      </w:r>
+      <w:r>
+        <w:rPr>
+          <w:rFonts w:ascii="Times New Roman" w:hAnsi="Times New Roman" w:eastAsia="Times New Roman"/>
+          <w:b w:val="0"/>
+          <w:i/>
+          <w:sz w:val="20"/>
+          <w:vertAlign w:val="subscript"/>
+        </w:rPr>
+        <w:t>8</w:t>
+      </w:r>
+      <w:r>
+        <w:rPr>
+          <w:rFonts w:ascii="Times New Roman" w:hAnsi="Times New Roman" w:eastAsia="Times New Roman"/>
+          <w:b w:val="0"/>
+          <w:i/>
+          <w:sz w:val="20"/>
+        </w:rPr>
+        <w:t>C</w:t>
+      </w:r>
+      <w:r>
+        <w:rPr>
+          <w:rFonts w:ascii="Times New Roman" w:hAnsi="Times New Roman" w:eastAsia="Times New Roman"/>
+          <w:b w:val="0"/>
+          <w:i/>
+          <w:sz w:val="20"/>
+          <w:vertAlign w:val="subscript"/>
+        </w:rPr>
+        <w:t>3</w:t>
+      </w:r>
+      <w:r>
+        <w:rPr>
+          <w:rFonts w:ascii="Times New Roman" w:hAnsi="Times New Roman" w:eastAsia="Times New Roman"/>
+          <w:b w:val="0"/>
+          <w:i/>
+          <w:sz w:val="20"/>
+        </w:rPr>
+        <w:t>NF</w:t>
+      </w:r>
+      <w:r>
+        <w:rPr>
+          <w:rFonts w:ascii="Times New Roman" w:hAnsi="Times New Roman" w:eastAsia="Times New Roman"/>
+          <w:b w:val="0"/>
+          <w:i/>
+          <w:sz w:val="20"/>
+          <w:vertAlign w:val="subscript"/>
+        </w:rPr>
+        <w:t>2</w:t>
+      </w:r>
+      <w:r>
+        <w:rPr>
+          <w:rFonts w:ascii="Times New Roman" w:hAnsi="Times New Roman" w:eastAsia="Times New Roman"/>
+          <w:b w:val="0"/>
+          <w:i/>
+          <w:sz w:val="20"/>
+        </w:rPr>
+        <w:t>). The green dashed line marks the Fermi energy (4.268 eV). The VBM is at 4.027 eV (k-index 4) and the CBM is at 7.296 eV (k-index 2), yielding an indirect gap of 3.27 eV. The large gap is consistent with the high ionicity of the K–F bond.</w:t>
       </w:r>
     </w:p>
+    <w:p/>
     <w:p>
       <w:pPr>
         <w:pStyle w:val="Heading3"/>
@@ -14260,17 +15189,116 @@
       </w:r>
     </w:p>
     <w:p>
+      <w:pPr>
+        <w:jc w:val="center"/>
+      </w:pPr>
+      <w:r>
+        <w:drawing>
+          <wp:inline xmlns:a="http://schemas.openxmlformats.org/drawingml/2006/main" xmlns:pic="http://schemas.openxmlformats.org/drawingml/2006/picture">
+            <wp:extent cx="5029200" cy="3017520"/>
+            <wp:docPr id="10" name="Picture 10"/>
+            <wp:cNvGraphicFramePr>
+              <a:graphicFrameLocks noChangeAspect="1"/>
+            </wp:cNvGraphicFramePr>
+            <a:graphic>
+              <a:graphicData uri="http://schemas.openxmlformats.org/drawingml/2006/picture">
+                <pic:pic>
+                  <pic:nvPicPr>
+                    <pic:cNvPr id="0" name="crystal_0912_dos.png"/>
+                    <pic:cNvPicPr/>
+                  </pic:nvPicPr>
+                  <pic:blipFill>
+                    <a:blip r:embed="rId18"/>
+                    <a:stretch>
+                      <a:fillRect/>
+                    </a:stretch>
+                  </pic:blipFill>
+                  <pic:spPr>
+                    <a:xfrm>
+                      <a:off x="0" y="0"/>
+                      <a:ext cx="5029200" cy="3017520"/>
+                    </a:xfrm>
+                    <a:prstGeom prst="rect"/>
+                  </pic:spPr>
+                </pic:pic>
+              </a:graphicData>
+            </a:graphic>
+          </wp:inline>
+        </w:drawing>
+      </w:r>
+    </w:p>
+    <w:p>
+      <w:pPr>
+        <w:jc w:val="center"/>
+      </w:pPr>
       <w:r>
         <w:rPr>
           <w:rFonts w:ascii="Times New Roman" w:hAnsi="Times New Roman" w:eastAsia="Times New Roman"/>
           <w:b w:val="0"/>
           <w:i/>
-          <w:color w:val="FF0000"/>
-          <w:sz w:val="22"/>
+          <w:sz w:val="20"/>
         </w:rPr>
-        <w:t>[Image not found: D:\virtual-element-hybrid-crystals\paper\figures_png\crystal_0912_dos.png]</w:t>
+        <w:t>Density of states (DOS) for crystal_0912 (KH</w:t>
+      </w:r>
+      <w:r>
+        <w:rPr>
+          <w:rFonts w:ascii="Times New Roman" w:hAnsi="Times New Roman" w:eastAsia="Times New Roman"/>
+          <w:b w:val="0"/>
+          <w:i/>
+          <w:sz w:val="20"/>
+          <w:vertAlign w:val="subscript"/>
+        </w:rPr>
+        <w:t>8</w:t>
+      </w:r>
+      <w:r>
+        <w:rPr>
+          <w:rFonts w:ascii="Times New Roman" w:hAnsi="Times New Roman" w:eastAsia="Times New Roman"/>
+          <w:b w:val="0"/>
+          <w:i/>
+          <w:sz w:val="20"/>
+        </w:rPr>
+        <w:t>C</w:t>
+      </w:r>
+      <w:r>
+        <w:rPr>
+          <w:rFonts w:ascii="Times New Roman" w:hAnsi="Times New Roman" w:eastAsia="Times New Roman"/>
+          <w:b w:val="0"/>
+          <w:i/>
+          <w:sz w:val="20"/>
+          <w:vertAlign w:val="subscript"/>
+        </w:rPr>
+        <w:t>3</w:t>
+      </w:r>
+      <w:r>
+        <w:rPr>
+          <w:rFonts w:ascii="Times New Roman" w:hAnsi="Times New Roman" w:eastAsia="Times New Roman"/>
+          <w:b w:val="0"/>
+          <w:i/>
+          <w:sz w:val="20"/>
+        </w:rPr>
+        <w:t>NF</w:t>
+      </w:r>
+      <w:r>
+        <w:rPr>
+          <w:rFonts w:ascii="Times New Roman" w:hAnsi="Times New Roman" w:eastAsia="Times New Roman"/>
+          <w:b w:val="0"/>
+          <w:i/>
+          <w:sz w:val="20"/>
+          <w:vertAlign w:val="subscript"/>
+        </w:rPr>
+        <w:t>2</w:t>
+      </w:r>
+      <w:r>
+        <w:rPr>
+          <w:rFonts w:ascii="Times New Roman" w:hAnsi="Times New Roman" w:eastAsia="Times New Roman"/>
+          <w:b w:val="0"/>
+          <w:i/>
+          <w:sz w:val="20"/>
+        </w:rPr>
+        <w:t>).</w:t>
       </w:r>
     </w:p>
+    <w:p/>
     <w:p>
       <w:pPr>
         <w:pStyle w:val="Heading3"/>
@@ -14287,17 +15315,116 @@
       </w:r>
     </w:p>
     <w:p>
+      <w:pPr>
+        <w:jc w:val="center"/>
+      </w:pPr>
+      <w:r>
+        <w:drawing>
+          <wp:inline xmlns:a="http://schemas.openxmlformats.org/drawingml/2006/main" xmlns:pic="http://schemas.openxmlformats.org/drawingml/2006/picture">
+            <wp:extent cx="5029200" cy="3352800"/>
+            <wp:docPr id="11" name="Picture 11"/>
+            <wp:cNvGraphicFramePr>
+              <a:graphicFrameLocks noChangeAspect="1"/>
+            </wp:cNvGraphicFramePr>
+            <a:graphic>
+              <a:graphicData uri="http://schemas.openxmlformats.org/drawingml/2006/picture">
+                <pic:pic>
+                  <pic:nvPicPr>
+                    <pic:cNvPr id="0" name="crystal_0217_bands.png"/>
+                    <pic:cNvPicPr/>
+                  </pic:nvPicPr>
+                  <pic:blipFill>
+                    <a:blip r:embed="rId19"/>
+                    <a:stretch>
+                      <a:fillRect/>
+                    </a:stretch>
+                  </pic:blipFill>
+                  <pic:spPr>
+                    <a:xfrm>
+                      <a:off x="0" y="0"/>
+                      <a:ext cx="5029200" cy="3352800"/>
+                    </a:xfrm>
+                    <a:prstGeom prst="rect"/>
+                  </pic:spPr>
+                </pic:pic>
+              </a:graphicData>
+            </a:graphic>
+          </wp:inline>
+        </w:drawing>
+      </w:r>
+    </w:p>
+    <w:p>
+      <w:pPr>
+        <w:jc w:val="center"/>
+      </w:pPr>
       <w:r>
         <w:rPr>
           <w:rFonts w:ascii="Times New Roman" w:hAnsi="Times New Roman" w:eastAsia="Times New Roman"/>
           <w:b w:val="0"/>
           <w:i/>
-          <w:color w:val="FF0000"/>
-          <w:sz w:val="22"/>
+          <w:sz w:val="20"/>
         </w:rPr>
-        <w:t>[Image not found: D:\virtual-element-hybrid-crystals\paper\figures_png\crystal_0217_bands.png]</w:t>
+        <w:t>Band distribution plot for crystal_0217 (MnH</w:t>
+      </w:r>
+      <w:r>
+        <w:rPr>
+          <w:rFonts w:ascii="Times New Roman" w:hAnsi="Times New Roman" w:eastAsia="Times New Roman"/>
+          <w:b w:val="0"/>
+          <w:i/>
+          <w:sz w:val="20"/>
+          <w:vertAlign w:val="subscript"/>
+        </w:rPr>
+        <w:t>8</w:t>
+      </w:r>
+      <w:r>
+        <w:rPr>
+          <w:rFonts w:ascii="Times New Roman" w:hAnsi="Times New Roman" w:eastAsia="Times New Roman"/>
+          <w:b w:val="0"/>
+          <w:i/>
+          <w:sz w:val="20"/>
+        </w:rPr>
+        <w:t>C</w:t>
+      </w:r>
+      <w:r>
+        <w:rPr>
+          <w:rFonts w:ascii="Times New Roman" w:hAnsi="Times New Roman" w:eastAsia="Times New Roman"/>
+          <w:b w:val="0"/>
+          <w:i/>
+          <w:sz w:val="20"/>
+          <w:vertAlign w:val="subscript"/>
+        </w:rPr>
+        <w:t>3</w:t>
+      </w:r>
+      <w:r>
+        <w:rPr>
+          <w:rFonts w:ascii="Times New Roman" w:hAnsi="Times New Roman" w:eastAsia="Times New Roman"/>
+          <w:b w:val="0"/>
+          <w:i/>
+          <w:sz w:val="20"/>
+        </w:rPr>
+        <w:t>I</w:t>
+      </w:r>
+      <w:r>
+        <w:rPr>
+          <w:rFonts w:ascii="Times New Roman" w:hAnsi="Times New Roman" w:eastAsia="Times New Roman"/>
+          <w:b w:val="0"/>
+          <w:i/>
+          <w:sz w:val="20"/>
+          <w:vertAlign w:val="subscript"/>
+        </w:rPr>
+        <w:t>3</w:t>
+      </w:r>
+      <w:r>
+        <w:rPr>
+          <w:rFonts w:ascii="Times New Roman" w:hAnsi="Times New Roman" w:eastAsia="Times New Roman"/>
+          <w:b w:val="0"/>
+          <w:i/>
+          <w:sz w:val="20"/>
+        </w:rPr>
+        <w:t>N). The VBM is at 4.475 eV (k-index 12) and the CBM is at 4.936 eV (k-index 23), yielding an indirect gap of 0.46 eV. The narrow gap is typical of transition-metal halides with d-electron contributions near the Fermi level.</w:t>
       </w:r>
     </w:p>
+    <w:p/>
     <w:p>
       <w:pPr>
         <w:pStyle w:val="Heading3"/>
@@ -14314,17 +15441,116 @@
       </w:r>
     </w:p>
     <w:p>
+      <w:pPr>
+        <w:jc w:val="center"/>
+      </w:pPr>
+      <w:r>
+        <w:drawing>
+          <wp:inline xmlns:a="http://schemas.openxmlformats.org/drawingml/2006/main" xmlns:pic="http://schemas.openxmlformats.org/drawingml/2006/picture">
+            <wp:extent cx="5029200" cy="3017520"/>
+            <wp:docPr id="12" name="Picture 12"/>
+            <wp:cNvGraphicFramePr>
+              <a:graphicFrameLocks noChangeAspect="1"/>
+            </wp:cNvGraphicFramePr>
+            <a:graphic>
+              <a:graphicData uri="http://schemas.openxmlformats.org/drawingml/2006/picture">
+                <pic:pic>
+                  <pic:nvPicPr>
+                    <pic:cNvPr id="0" name="crystal_0217_dos.png"/>
+                    <pic:cNvPicPr/>
+                  </pic:nvPicPr>
+                  <pic:blipFill>
+                    <a:blip r:embed="rId20"/>
+                    <a:stretch>
+                      <a:fillRect/>
+                    </a:stretch>
+                  </pic:blipFill>
+                  <pic:spPr>
+                    <a:xfrm>
+                      <a:off x="0" y="0"/>
+                      <a:ext cx="5029200" cy="3017520"/>
+                    </a:xfrm>
+                    <a:prstGeom prst="rect"/>
+                  </pic:spPr>
+                </pic:pic>
+              </a:graphicData>
+            </a:graphic>
+          </wp:inline>
+        </w:drawing>
+      </w:r>
+    </w:p>
+    <w:p>
+      <w:pPr>
+        <w:jc w:val="center"/>
+      </w:pPr>
       <w:r>
         <w:rPr>
           <w:rFonts w:ascii="Times New Roman" w:hAnsi="Times New Roman" w:eastAsia="Times New Roman"/>
           <w:b w:val="0"/>
           <w:i/>
-          <w:color w:val="FF0000"/>
-          <w:sz w:val="22"/>
+          <w:sz w:val="20"/>
         </w:rPr>
-        <w:t>[Image not found: D:\virtual-element-hybrid-crystals\paper\figures_png\crystal_0217_dos.png]</w:t>
+        <w:t>Density of states (DOS) for crystal_0217 (MnH</w:t>
+      </w:r>
+      <w:r>
+        <w:rPr>
+          <w:rFonts w:ascii="Times New Roman" w:hAnsi="Times New Roman" w:eastAsia="Times New Roman"/>
+          <w:b w:val="0"/>
+          <w:i/>
+          <w:sz w:val="20"/>
+          <w:vertAlign w:val="subscript"/>
+        </w:rPr>
+        <w:t>8</w:t>
+      </w:r>
+      <w:r>
+        <w:rPr>
+          <w:rFonts w:ascii="Times New Roman" w:hAnsi="Times New Roman" w:eastAsia="Times New Roman"/>
+          <w:b w:val="0"/>
+          <w:i/>
+          <w:sz w:val="20"/>
+        </w:rPr>
+        <w:t>C</w:t>
+      </w:r>
+      <w:r>
+        <w:rPr>
+          <w:rFonts w:ascii="Times New Roman" w:hAnsi="Times New Roman" w:eastAsia="Times New Roman"/>
+          <w:b w:val="0"/>
+          <w:i/>
+          <w:sz w:val="20"/>
+          <w:vertAlign w:val="subscript"/>
+        </w:rPr>
+        <w:t>3</w:t>
+      </w:r>
+      <w:r>
+        <w:rPr>
+          <w:rFonts w:ascii="Times New Roman" w:hAnsi="Times New Roman" w:eastAsia="Times New Roman"/>
+          <w:b w:val="0"/>
+          <w:i/>
+          <w:sz w:val="20"/>
+        </w:rPr>
+        <w:t>I</w:t>
+      </w:r>
+      <w:r>
+        <w:rPr>
+          <w:rFonts w:ascii="Times New Roman" w:hAnsi="Times New Roman" w:eastAsia="Times New Roman"/>
+          <w:b w:val="0"/>
+          <w:i/>
+          <w:sz w:val="20"/>
+          <w:vertAlign w:val="subscript"/>
+        </w:rPr>
+        <w:t>3</w:t>
+      </w:r>
+      <w:r>
+        <w:rPr>
+          <w:rFonts w:ascii="Times New Roman" w:hAnsi="Times New Roman" w:eastAsia="Times New Roman"/>
+          <w:b w:val="0"/>
+          <w:i/>
+          <w:sz w:val="20"/>
+        </w:rPr>
+        <w:t>N).</w:t>
       </w:r>
     </w:p>
+    <w:p/>
     <w:p>
       <w:pPr>
         <w:pStyle w:val="Heading3"/>
@@ -14341,17 +15567,116 @@
       </w:r>
     </w:p>
     <w:p>
+      <w:pPr>
+        <w:jc w:val="center"/>
+      </w:pPr>
+      <w:r>
+        <w:drawing>
+          <wp:inline xmlns:a="http://schemas.openxmlformats.org/drawingml/2006/main" xmlns:pic="http://schemas.openxmlformats.org/drawingml/2006/picture">
+            <wp:extent cx="5029200" cy="3352800"/>
+            <wp:docPr id="13" name="Picture 13"/>
+            <wp:cNvGraphicFramePr>
+              <a:graphicFrameLocks noChangeAspect="1"/>
+            </wp:cNvGraphicFramePr>
+            <a:graphic>
+              <a:graphicData uri="http://schemas.openxmlformats.org/drawingml/2006/picture">
+                <pic:pic>
+                  <pic:nvPicPr>
+                    <pic:cNvPr id="0" name="crystal_0672_bands.png"/>
+                    <pic:cNvPicPr/>
+                  </pic:nvPicPr>
+                  <pic:blipFill>
+                    <a:blip r:embed="rId21"/>
+                    <a:stretch>
+                      <a:fillRect/>
+                    </a:stretch>
+                  </pic:blipFill>
+                  <pic:spPr>
+                    <a:xfrm>
+                      <a:off x="0" y="0"/>
+                      <a:ext cx="5029200" cy="3352800"/>
+                    </a:xfrm>
+                    <a:prstGeom prst="rect"/>
+                  </pic:spPr>
+                </pic:pic>
+              </a:graphicData>
+            </a:graphic>
+          </wp:inline>
+        </w:drawing>
+      </w:r>
+    </w:p>
+    <w:p>
+      <w:pPr>
+        <w:jc w:val="center"/>
+      </w:pPr>
       <w:r>
         <w:rPr>
           <w:rFonts w:ascii="Times New Roman" w:hAnsi="Times New Roman" w:eastAsia="Times New Roman"/>
           <w:b w:val="0"/>
           <w:i/>
-          <w:color w:val="FF0000"/>
-          <w:sz w:val="22"/>
+          <w:sz w:val="20"/>
         </w:rPr>
-        <w:t>[Image not found: D:\virtual-element-hybrid-crystals\paper\figures_png\crystal_0672_bands.png]</w:t>
+        <w:t>Band distribution plot for crystal_0672 (FeH</w:t>
+      </w:r>
+      <w:r>
+        <w:rPr>
+          <w:rFonts w:ascii="Times New Roman" w:hAnsi="Times New Roman" w:eastAsia="Times New Roman"/>
+          <w:b w:val="0"/>
+          <w:i/>
+          <w:sz w:val="20"/>
+          <w:vertAlign w:val="subscript"/>
+        </w:rPr>
+        <w:t>8</w:t>
+      </w:r>
+      <w:r>
+        <w:rPr>
+          <w:rFonts w:ascii="Times New Roman" w:hAnsi="Times New Roman" w:eastAsia="Times New Roman"/>
+          <w:b w:val="0"/>
+          <w:i/>
+          <w:sz w:val="20"/>
+        </w:rPr>
+        <w:t>C</w:t>
+      </w:r>
+      <w:r>
+        <w:rPr>
+          <w:rFonts w:ascii="Times New Roman" w:hAnsi="Times New Roman" w:eastAsia="Times New Roman"/>
+          <w:b w:val="0"/>
+          <w:i/>
+          <w:sz w:val="20"/>
+          <w:vertAlign w:val="subscript"/>
+        </w:rPr>
+        <w:t>3</w:t>
+      </w:r>
+      <w:r>
+        <w:rPr>
+          <w:rFonts w:ascii="Times New Roman" w:hAnsi="Times New Roman" w:eastAsia="Times New Roman"/>
+          <w:b w:val="0"/>
+          <w:i/>
+          <w:sz w:val="20"/>
+        </w:rPr>
+        <w:t>Br</w:t>
+      </w:r>
+      <w:r>
+        <w:rPr>
+          <w:rFonts w:ascii="Times New Roman" w:hAnsi="Times New Roman" w:eastAsia="Times New Roman"/>
+          <w:b w:val="0"/>
+          <w:i/>
+          <w:sz w:val="20"/>
+          <w:vertAlign w:val="subscript"/>
+        </w:rPr>
+        <w:t>3</w:t>
+      </w:r>
+      <w:r>
+        <w:rPr>
+          <w:rFonts w:ascii="Times New Roman" w:hAnsi="Times New Roman" w:eastAsia="Times New Roman"/>
+          <w:b w:val="0"/>
+          <w:i/>
+          <w:sz w:val="20"/>
+        </w:rPr>
+        <w:t>N). The VBM is at 3.817 eV (k-index 5) and the CBM is at 4.355 eV (k-index 20), yielding an indirect gap of 0.54 eV.</w:t>
       </w:r>
     </w:p>
+    <w:p/>
     <w:p>
       <w:pPr>
         <w:pStyle w:val="Heading3"/>
@@ -14368,17 +15693,116 @@
       </w:r>
     </w:p>
     <w:p>
+      <w:pPr>
+        <w:jc w:val="center"/>
+      </w:pPr>
+      <w:r>
+        <w:drawing>
+          <wp:inline xmlns:a="http://schemas.openxmlformats.org/drawingml/2006/main" xmlns:pic="http://schemas.openxmlformats.org/drawingml/2006/picture">
+            <wp:extent cx="5029200" cy="3017520"/>
+            <wp:docPr id="14" name="Picture 14"/>
+            <wp:cNvGraphicFramePr>
+              <a:graphicFrameLocks noChangeAspect="1"/>
+            </wp:cNvGraphicFramePr>
+            <a:graphic>
+              <a:graphicData uri="http://schemas.openxmlformats.org/drawingml/2006/picture">
+                <pic:pic>
+                  <pic:nvPicPr>
+                    <pic:cNvPr id="0" name="crystal_0672_dos.png"/>
+                    <pic:cNvPicPr/>
+                  </pic:nvPicPr>
+                  <pic:blipFill>
+                    <a:blip r:embed="rId22"/>
+                    <a:stretch>
+                      <a:fillRect/>
+                    </a:stretch>
+                  </pic:blipFill>
+                  <pic:spPr>
+                    <a:xfrm>
+                      <a:off x="0" y="0"/>
+                      <a:ext cx="5029200" cy="3017520"/>
+                    </a:xfrm>
+                    <a:prstGeom prst="rect"/>
+                  </pic:spPr>
+                </pic:pic>
+              </a:graphicData>
+            </a:graphic>
+          </wp:inline>
+        </w:drawing>
+      </w:r>
+    </w:p>
+    <w:p>
+      <w:pPr>
+        <w:jc w:val="center"/>
+      </w:pPr>
       <w:r>
         <w:rPr>
           <w:rFonts w:ascii="Times New Roman" w:hAnsi="Times New Roman" w:eastAsia="Times New Roman"/>
           <w:b w:val="0"/>
           <w:i/>
-          <w:color w:val="FF0000"/>
-          <w:sz w:val="22"/>
+          <w:sz w:val="20"/>
         </w:rPr>
-        <w:t>[Image not found: D:\virtual-element-hybrid-crystals\paper\figures_png\crystal_0672_dos.png]</w:t>
+        <w:t>Density of states (DOS) for crystal_0672 (FeH</w:t>
+      </w:r>
+      <w:r>
+        <w:rPr>
+          <w:rFonts w:ascii="Times New Roman" w:hAnsi="Times New Roman" w:eastAsia="Times New Roman"/>
+          <w:b w:val="0"/>
+          <w:i/>
+          <w:sz w:val="20"/>
+          <w:vertAlign w:val="subscript"/>
+        </w:rPr>
+        <w:t>8</w:t>
+      </w:r>
+      <w:r>
+        <w:rPr>
+          <w:rFonts w:ascii="Times New Roman" w:hAnsi="Times New Roman" w:eastAsia="Times New Roman"/>
+          <w:b w:val="0"/>
+          <w:i/>
+          <w:sz w:val="20"/>
+        </w:rPr>
+        <w:t>C</w:t>
+      </w:r>
+      <w:r>
+        <w:rPr>
+          <w:rFonts w:ascii="Times New Roman" w:hAnsi="Times New Roman" w:eastAsia="Times New Roman"/>
+          <w:b w:val="0"/>
+          <w:i/>
+          <w:sz w:val="20"/>
+          <w:vertAlign w:val="subscript"/>
+        </w:rPr>
+        <w:t>3</w:t>
+      </w:r>
+      <w:r>
+        <w:rPr>
+          <w:rFonts w:ascii="Times New Roman" w:hAnsi="Times New Roman" w:eastAsia="Times New Roman"/>
+          <w:b w:val="0"/>
+          <w:i/>
+          <w:sz w:val="20"/>
+        </w:rPr>
+        <w:t>Br</w:t>
+      </w:r>
+      <w:r>
+        <w:rPr>
+          <w:rFonts w:ascii="Times New Roman" w:hAnsi="Times New Roman" w:eastAsia="Times New Roman"/>
+          <w:b w:val="0"/>
+          <w:i/>
+          <w:sz w:val="20"/>
+          <w:vertAlign w:val="subscript"/>
+        </w:rPr>
+        <w:t>3</w:t>
+      </w:r>
+      <w:r>
+        <w:rPr>
+          <w:rFonts w:ascii="Times New Roman" w:hAnsi="Times New Roman" w:eastAsia="Times New Roman"/>
+          <w:b w:val="0"/>
+          <w:i/>
+          <w:sz w:val="20"/>
+        </w:rPr>
+        <w:t>N).</w:t>
       </w:r>
     </w:p>
+    <w:p/>
     <w:p>
       <w:pPr>
         <w:pStyle w:val="Heading3"/>
@@ -14395,17 +15819,135 @@
       </w:r>
     </w:p>
     <w:p>
+      <w:pPr>
+        <w:jc w:val="center"/>
+      </w:pPr>
+      <w:r>
+        <w:drawing>
+          <wp:inline xmlns:a="http://schemas.openxmlformats.org/drawingml/2006/main" xmlns:pic="http://schemas.openxmlformats.org/drawingml/2006/picture">
+            <wp:extent cx="5029200" cy="3352800"/>
+            <wp:docPr id="15" name="Picture 15"/>
+            <wp:cNvGraphicFramePr>
+              <a:graphicFrameLocks noChangeAspect="1"/>
+            </wp:cNvGraphicFramePr>
+            <a:graphic>
+              <a:graphicData uri="http://schemas.openxmlformats.org/drawingml/2006/picture">
+                <pic:pic>
+                  <pic:nvPicPr>
+                    <pic:cNvPr id="0" name="crystal_0927_bands.png"/>
+                    <pic:cNvPicPr/>
+                  </pic:nvPicPr>
+                  <pic:blipFill>
+                    <a:blip r:embed="rId23"/>
+                    <a:stretch>
+                      <a:fillRect/>
+                    </a:stretch>
+                  </pic:blipFill>
+                  <pic:spPr>
+                    <a:xfrm>
+                      <a:off x="0" y="0"/>
+                      <a:ext cx="5029200" cy="3352800"/>
+                    </a:xfrm>
+                    <a:prstGeom prst="rect"/>
+                  </pic:spPr>
+                </pic:pic>
+              </a:graphicData>
+            </a:graphic>
+          </wp:inline>
+        </w:drawing>
+      </w:r>
+    </w:p>
+    <w:p>
+      <w:pPr>
+        <w:jc w:val="center"/>
+      </w:pPr>
       <w:r>
         <w:rPr>
           <w:rFonts w:ascii="Times New Roman" w:hAnsi="Times New Roman" w:eastAsia="Times New Roman"/>
           <w:b w:val="0"/>
           <w:i/>
-          <w:color w:val="FF0000"/>
-          <w:sz w:val="22"/>
+          <w:sz w:val="20"/>
         </w:rPr>
-        <w:t>[Image not found: D:\virtual-element-hybrid-crystals\paper\figures_png\crystal_0927_bands.png]</w:t>
+        <w:t>Band distribution plot for crystal_0927 (CoH</w:t>
+      </w:r>
+      <w:r>
+        <w:rPr>
+          <w:rFonts w:ascii="Times New Roman" w:hAnsi="Times New Roman" w:eastAsia="Times New Roman"/>
+          <w:b w:val="0"/>
+          <w:i/>
+          <w:sz w:val="20"/>
+          <w:vertAlign w:val="subscript"/>
+        </w:rPr>
+        <w:t>12</w:t>
+      </w:r>
+      <w:r>
+        <w:rPr>
+          <w:rFonts w:ascii="Times New Roman" w:hAnsi="Times New Roman" w:eastAsia="Times New Roman"/>
+          <w:b w:val="0"/>
+          <w:i/>
+          <w:sz w:val="20"/>
+        </w:rPr>
+        <w:t>C</w:t>
+      </w:r>
+      <w:r>
+        <w:rPr>
+          <w:rFonts w:ascii="Times New Roman" w:hAnsi="Times New Roman" w:eastAsia="Times New Roman"/>
+          <w:b w:val="0"/>
+          <w:i/>
+          <w:sz w:val="20"/>
+          <w:vertAlign w:val="subscript"/>
+        </w:rPr>
+        <w:t>2</w:t>
+      </w:r>
+      <w:r>
+        <w:rPr>
+          <w:rFonts w:ascii="Times New Roman" w:hAnsi="Times New Roman" w:eastAsia="Times New Roman"/>
+          <w:b w:val="0"/>
+          <w:i/>
+          <w:sz w:val="20"/>
+        </w:rPr>
+        <w:t>N</w:t>
+      </w:r>
+      <w:r>
+        <w:rPr>
+          <w:rFonts w:ascii="Times New Roman" w:hAnsi="Times New Roman" w:eastAsia="Times New Roman"/>
+          <w:b w:val="0"/>
+          <w:i/>
+          <w:sz w:val="20"/>
+          <w:vertAlign w:val="subscript"/>
+        </w:rPr>
+        <w:t>2</w:t>
+      </w:r>
+      <w:r>
+        <w:rPr>
+          <w:rFonts w:ascii="Times New Roman" w:hAnsi="Times New Roman" w:eastAsia="Times New Roman"/>
+          <w:b w:val="0"/>
+          <w:i/>
+          <w:sz w:val="20"/>
+        </w:rPr>
+        <w:t>Cl</w:t>
+      </w:r>
+      <w:r>
+        <w:rPr>
+          <w:rFonts w:ascii="Times New Roman" w:hAnsi="Times New Roman" w:eastAsia="Times New Roman"/>
+          <w:b w:val="0"/>
+          <w:i/>
+          <w:sz w:val="20"/>
+          <w:vertAlign w:val="subscript"/>
+        </w:rPr>
+        <w:t>4</w:t>
+      </w:r>
+      <w:r>
+        <w:rPr>
+          <w:rFonts w:ascii="Times New Roman" w:hAnsi="Times New Roman" w:eastAsia="Times New Roman"/>
+          <w:b w:val="0"/>
+          <w:i/>
+          <w:sz w:val="20"/>
+        </w:rPr>
+        <w:t>). The VBM is at 1.939 eV (k-index 4) and the CBM is at 2.477 eV (k-index 2), yielding an indirect gap of 0.54 eV.</w:t>
       </w:r>
     </w:p>
+    <w:p/>
     <w:p>
       <w:pPr>
         <w:pStyle w:val="Heading3"/>
@@ -14422,17 +15964,135 @@
       </w:r>
     </w:p>
     <w:p>
+      <w:pPr>
+        <w:jc w:val="center"/>
+      </w:pPr>
+      <w:r>
+        <w:drawing>
+          <wp:inline xmlns:a="http://schemas.openxmlformats.org/drawingml/2006/main" xmlns:pic="http://schemas.openxmlformats.org/drawingml/2006/picture">
+            <wp:extent cx="5029200" cy="3017520"/>
+            <wp:docPr id="16" name="Picture 16"/>
+            <wp:cNvGraphicFramePr>
+              <a:graphicFrameLocks noChangeAspect="1"/>
+            </wp:cNvGraphicFramePr>
+            <a:graphic>
+              <a:graphicData uri="http://schemas.openxmlformats.org/drawingml/2006/picture">
+                <pic:pic>
+                  <pic:nvPicPr>
+                    <pic:cNvPr id="0" name="crystal_0927_dos.png"/>
+                    <pic:cNvPicPr/>
+                  </pic:nvPicPr>
+                  <pic:blipFill>
+                    <a:blip r:embed="rId24"/>
+                    <a:stretch>
+                      <a:fillRect/>
+                    </a:stretch>
+                  </pic:blipFill>
+                  <pic:spPr>
+                    <a:xfrm>
+                      <a:off x="0" y="0"/>
+                      <a:ext cx="5029200" cy="3017520"/>
+                    </a:xfrm>
+                    <a:prstGeom prst="rect"/>
+                  </pic:spPr>
+                </pic:pic>
+              </a:graphicData>
+            </a:graphic>
+          </wp:inline>
+        </w:drawing>
+      </w:r>
+    </w:p>
+    <w:p>
+      <w:pPr>
+        <w:jc w:val="center"/>
+      </w:pPr>
       <w:r>
         <w:rPr>
           <w:rFonts w:ascii="Times New Roman" w:hAnsi="Times New Roman" w:eastAsia="Times New Roman"/>
           <w:b w:val="0"/>
           <w:i/>
-          <w:color w:val="FF0000"/>
-          <w:sz w:val="22"/>
+          <w:sz w:val="20"/>
         </w:rPr>
-        <w:t>[Image not found: D:\virtual-element-hybrid-crystals\paper\figures_png\crystal_0927_dos.png]</w:t>
+        <w:t>Density of states (DOS) for crystal_0927 (CoH</w:t>
+      </w:r>
+      <w:r>
+        <w:rPr>
+          <w:rFonts w:ascii="Times New Roman" w:hAnsi="Times New Roman" w:eastAsia="Times New Roman"/>
+          <w:b w:val="0"/>
+          <w:i/>
+          <w:sz w:val="20"/>
+          <w:vertAlign w:val="subscript"/>
+        </w:rPr>
+        <w:t>12</w:t>
+      </w:r>
+      <w:r>
+        <w:rPr>
+          <w:rFonts w:ascii="Times New Roman" w:hAnsi="Times New Roman" w:eastAsia="Times New Roman"/>
+          <w:b w:val="0"/>
+          <w:i/>
+          <w:sz w:val="20"/>
+        </w:rPr>
+        <w:t>C</w:t>
+      </w:r>
+      <w:r>
+        <w:rPr>
+          <w:rFonts w:ascii="Times New Roman" w:hAnsi="Times New Roman" w:eastAsia="Times New Roman"/>
+          <w:b w:val="0"/>
+          <w:i/>
+          <w:sz w:val="20"/>
+          <w:vertAlign w:val="subscript"/>
+        </w:rPr>
+        <w:t>2</w:t>
+      </w:r>
+      <w:r>
+        <w:rPr>
+          <w:rFonts w:ascii="Times New Roman" w:hAnsi="Times New Roman" w:eastAsia="Times New Roman"/>
+          <w:b w:val="0"/>
+          <w:i/>
+          <w:sz w:val="20"/>
+        </w:rPr>
+        <w:t>N</w:t>
+      </w:r>
+      <w:r>
+        <w:rPr>
+          <w:rFonts w:ascii="Times New Roman" w:hAnsi="Times New Roman" w:eastAsia="Times New Roman"/>
+          <w:b w:val="0"/>
+          <w:i/>
+          <w:sz w:val="20"/>
+          <w:vertAlign w:val="subscript"/>
+        </w:rPr>
+        <w:t>2</w:t>
+      </w:r>
+      <w:r>
+        <w:rPr>
+          <w:rFonts w:ascii="Times New Roman" w:hAnsi="Times New Roman" w:eastAsia="Times New Roman"/>
+          <w:b w:val="0"/>
+          <w:i/>
+          <w:sz w:val="20"/>
+        </w:rPr>
+        <w:t>Cl</w:t>
+      </w:r>
+      <w:r>
+        <w:rPr>
+          <w:rFonts w:ascii="Times New Roman" w:hAnsi="Times New Roman" w:eastAsia="Times New Roman"/>
+          <w:b w:val="0"/>
+          <w:i/>
+          <w:sz w:val="20"/>
+          <w:vertAlign w:val="subscript"/>
+        </w:rPr>
+        <w:t>4</w:t>
+      </w:r>
+      <w:r>
+        <w:rPr>
+          <w:rFonts w:ascii="Times New Roman" w:hAnsi="Times New Roman" w:eastAsia="Times New Roman"/>
+          <w:b w:val="0"/>
+          <w:i/>
+          <w:sz w:val="20"/>
+        </w:rPr>
+        <w:t>).</w:t>
       </w:r>
     </w:p>
+    <w:p/>
     <w:p>
       <w:pPr>
         <w:pStyle w:val="Heading3"/>
@@ -14449,17 +16109,135 @@
       </w:r>
     </w:p>
     <w:p>
+      <w:pPr>
+        <w:jc w:val="center"/>
+      </w:pPr>
+      <w:r>
+        <w:drawing>
+          <wp:inline xmlns:a="http://schemas.openxmlformats.org/drawingml/2006/main" xmlns:pic="http://schemas.openxmlformats.org/drawingml/2006/picture">
+            <wp:extent cx="5029200" cy="3352800"/>
+            <wp:docPr id="17" name="Picture 17"/>
+            <wp:cNvGraphicFramePr>
+              <a:graphicFrameLocks noChangeAspect="1"/>
+            </wp:cNvGraphicFramePr>
+            <a:graphic>
+              <a:graphicData uri="http://schemas.openxmlformats.org/drawingml/2006/picture">
+                <pic:pic>
+                  <pic:nvPicPr>
+                    <pic:cNvPr id="0" name="crystal_0626_bands.png"/>
+                    <pic:cNvPicPr/>
+                  </pic:nvPicPr>
+                  <pic:blipFill>
+                    <a:blip r:embed="rId25"/>
+                    <a:stretch>
+                      <a:fillRect/>
+                    </a:stretch>
+                  </pic:blipFill>
+                  <pic:spPr>
+                    <a:xfrm>
+                      <a:off x="0" y="0"/>
+                      <a:ext cx="5029200" cy="3352800"/>
+                    </a:xfrm>
+                    <a:prstGeom prst="rect"/>
+                  </pic:spPr>
+                </pic:pic>
+              </a:graphicData>
+            </a:graphic>
+          </wp:inline>
+        </w:drawing>
+      </w:r>
+    </w:p>
+    <w:p>
+      <w:pPr>
+        <w:jc w:val="center"/>
+      </w:pPr>
       <w:r>
         <w:rPr>
           <w:rFonts w:ascii="Times New Roman" w:hAnsi="Times New Roman" w:eastAsia="Times New Roman"/>
           <w:b w:val="0"/>
           <w:i/>
-          <w:color w:val="FF0000"/>
-          <w:sz w:val="22"/>
+          <w:sz w:val="20"/>
         </w:rPr>
-        <w:t>[Image not found: D:\virtual-element-hybrid-crystals\paper\figures_png\crystal_0626_bands.png]</w:t>
+        <w:t>Band distribution plot for crystal_0626 (VH</w:t>
+      </w:r>
+      <w:r>
+        <w:rPr>
+          <w:rFonts w:ascii="Times New Roman" w:hAnsi="Times New Roman" w:eastAsia="Times New Roman"/>
+          <w:b w:val="0"/>
+          <w:i/>
+          <w:sz w:val="20"/>
+          <w:vertAlign w:val="subscript"/>
+        </w:rPr>
+        <w:t>11</w:t>
+      </w:r>
+      <w:r>
+        <w:rPr>
+          <w:rFonts w:ascii="Times New Roman" w:hAnsi="Times New Roman" w:eastAsia="Times New Roman"/>
+          <w:b w:val="0"/>
+          <w:i/>
+          <w:sz w:val="20"/>
+        </w:rPr>
+        <w:t>C</w:t>
+      </w:r>
+      <w:r>
+        <w:rPr>
+          <w:rFonts w:ascii="Times New Roman" w:hAnsi="Times New Roman" w:eastAsia="Times New Roman"/>
+          <w:b w:val="0"/>
+          <w:i/>
+          <w:sz w:val="20"/>
+          <w:vertAlign w:val="subscript"/>
+        </w:rPr>
+        <w:t>2</w:t>
+      </w:r>
+      <w:r>
+        <w:rPr>
+          <w:rFonts w:ascii="Times New Roman" w:hAnsi="Times New Roman" w:eastAsia="Times New Roman"/>
+          <w:b w:val="0"/>
+          <w:i/>
+          <w:sz w:val="20"/>
+        </w:rPr>
+        <w:t>Br</w:t>
+      </w:r>
+      <w:r>
+        <w:rPr>
+          <w:rFonts w:ascii="Times New Roman" w:hAnsi="Times New Roman" w:eastAsia="Times New Roman"/>
+          <w:b w:val="0"/>
+          <w:i/>
+          <w:sz w:val="20"/>
+          <w:vertAlign w:val="subscript"/>
+        </w:rPr>
+        <w:t>6</w:t>
+      </w:r>
+      <w:r>
+        <w:rPr>
+          <w:rFonts w:ascii="Times New Roman" w:hAnsi="Times New Roman" w:eastAsia="Times New Roman"/>
+          <w:b w:val="0"/>
+          <w:i/>
+          <w:sz w:val="20"/>
+        </w:rPr>
+        <w:t>N</w:t>
+      </w:r>
+      <w:r>
+        <w:rPr>
+          <w:rFonts w:ascii="Times New Roman" w:hAnsi="Times New Roman" w:eastAsia="Times New Roman"/>
+          <w:b w:val="0"/>
+          <w:i/>
+          <w:sz w:val="20"/>
+          <w:vertAlign w:val="subscript"/>
+        </w:rPr>
+        <w:t>3</w:t>
+      </w:r>
+      <w:r>
+        <w:rPr>
+          <w:rFonts w:ascii="Times New Roman" w:hAnsi="Times New Roman" w:eastAsia="Times New Roman"/>
+          <w:b w:val="0"/>
+          <w:i/>
+          <w:sz w:val="20"/>
+        </w:rPr>
+        <w:t>). The VBM is at −2.860 eV and the CBM is at −2.077 eV, both at the Gamma point (k-index 0), yielding a direct band gap of 0.78 eV. This is the only direct-band-gap structure among the ten calculated systems.</w:t>
       </w:r>
     </w:p>
+    <w:p/>
     <w:p>
       <w:pPr>
         <w:pStyle w:val="Heading3"/>
@@ -14476,17 +16254,135 @@
       </w:r>
     </w:p>
     <w:p>
+      <w:pPr>
+        <w:jc w:val="center"/>
+      </w:pPr>
+      <w:r>
+        <w:drawing>
+          <wp:inline xmlns:a="http://schemas.openxmlformats.org/drawingml/2006/main" xmlns:pic="http://schemas.openxmlformats.org/drawingml/2006/picture">
+            <wp:extent cx="5029200" cy="3017520"/>
+            <wp:docPr id="18" name="Picture 18"/>
+            <wp:cNvGraphicFramePr>
+              <a:graphicFrameLocks noChangeAspect="1"/>
+            </wp:cNvGraphicFramePr>
+            <a:graphic>
+              <a:graphicData uri="http://schemas.openxmlformats.org/drawingml/2006/picture">
+                <pic:pic>
+                  <pic:nvPicPr>
+                    <pic:cNvPr id="0" name="crystal_0626_dos.png"/>
+                    <pic:cNvPicPr/>
+                  </pic:nvPicPr>
+                  <pic:blipFill>
+                    <a:blip r:embed="rId26"/>
+                    <a:stretch>
+                      <a:fillRect/>
+                    </a:stretch>
+                  </pic:blipFill>
+                  <pic:spPr>
+                    <a:xfrm>
+                      <a:off x="0" y="0"/>
+                      <a:ext cx="5029200" cy="3017520"/>
+                    </a:xfrm>
+                    <a:prstGeom prst="rect"/>
+                  </pic:spPr>
+                </pic:pic>
+              </a:graphicData>
+            </a:graphic>
+          </wp:inline>
+        </w:drawing>
+      </w:r>
+    </w:p>
+    <w:p>
+      <w:pPr>
+        <w:jc w:val="center"/>
+      </w:pPr>
       <w:r>
         <w:rPr>
           <w:rFonts w:ascii="Times New Roman" w:hAnsi="Times New Roman" w:eastAsia="Times New Roman"/>
           <w:b w:val="0"/>
           <w:i/>
-          <w:color w:val="FF0000"/>
-          <w:sz w:val="22"/>
+          <w:sz w:val="20"/>
         </w:rPr>
-        <w:t>[Image not found: D:\virtual-element-hybrid-crystals\paper\figures_png\crystal_0626_dos.png]</w:t>
+        <w:t>Density of states (DOS) for crystal_0626 (VH</w:t>
+      </w:r>
+      <w:r>
+        <w:rPr>
+          <w:rFonts w:ascii="Times New Roman" w:hAnsi="Times New Roman" w:eastAsia="Times New Roman"/>
+          <w:b w:val="0"/>
+          <w:i/>
+          <w:sz w:val="20"/>
+          <w:vertAlign w:val="subscript"/>
+        </w:rPr>
+        <w:t>11</w:t>
+      </w:r>
+      <w:r>
+        <w:rPr>
+          <w:rFonts w:ascii="Times New Roman" w:hAnsi="Times New Roman" w:eastAsia="Times New Roman"/>
+          <w:b w:val="0"/>
+          <w:i/>
+          <w:sz w:val="20"/>
+        </w:rPr>
+        <w:t>C</w:t>
+      </w:r>
+      <w:r>
+        <w:rPr>
+          <w:rFonts w:ascii="Times New Roman" w:hAnsi="Times New Roman" w:eastAsia="Times New Roman"/>
+          <w:b w:val="0"/>
+          <w:i/>
+          <w:sz w:val="20"/>
+          <w:vertAlign w:val="subscript"/>
+        </w:rPr>
+        <w:t>2</w:t>
+      </w:r>
+      <w:r>
+        <w:rPr>
+          <w:rFonts w:ascii="Times New Roman" w:hAnsi="Times New Roman" w:eastAsia="Times New Roman"/>
+          <w:b w:val="0"/>
+          <w:i/>
+          <w:sz w:val="20"/>
+        </w:rPr>
+        <w:t>Br</w:t>
+      </w:r>
+      <w:r>
+        <w:rPr>
+          <w:rFonts w:ascii="Times New Roman" w:hAnsi="Times New Roman" w:eastAsia="Times New Roman"/>
+          <w:b w:val="0"/>
+          <w:i/>
+          <w:sz w:val="20"/>
+          <w:vertAlign w:val="subscript"/>
+        </w:rPr>
+        <w:t>6</w:t>
+      </w:r>
+      <w:r>
+        <w:rPr>
+          <w:rFonts w:ascii="Times New Roman" w:hAnsi="Times New Roman" w:eastAsia="Times New Roman"/>
+          <w:b w:val="0"/>
+          <w:i/>
+          <w:sz w:val="20"/>
+        </w:rPr>
+        <w:t>N</w:t>
+      </w:r>
+      <w:r>
+        <w:rPr>
+          <w:rFonts w:ascii="Times New Roman" w:hAnsi="Times New Roman" w:eastAsia="Times New Roman"/>
+          <w:b w:val="0"/>
+          <w:i/>
+          <w:sz w:val="20"/>
+          <w:vertAlign w:val="subscript"/>
+        </w:rPr>
+        <w:t>3</w:t>
+      </w:r>
+      <w:r>
+        <w:rPr>
+          <w:rFonts w:ascii="Times New Roman" w:hAnsi="Times New Roman" w:eastAsia="Times New Roman"/>
+          <w:b w:val="0"/>
+          <w:i/>
+          <w:sz w:val="20"/>
+        </w:rPr>
+        <w:t>).</w:t>
       </w:r>
     </w:p>
+    <w:p/>
     <w:p>
       <w:pPr>
         <w:pStyle w:val="Heading3"/>
@@ -14503,17 +16399,135 @@
       </w:r>
     </w:p>
     <w:p>
+      <w:pPr>
+        <w:jc w:val="center"/>
+      </w:pPr>
+      <w:r>
+        <w:drawing>
+          <wp:inline xmlns:a="http://schemas.openxmlformats.org/drawingml/2006/main" xmlns:pic="http://schemas.openxmlformats.org/drawingml/2006/picture">
+            <wp:extent cx="5029200" cy="3352800"/>
+            <wp:docPr id="19" name="Picture 19"/>
+            <wp:cNvGraphicFramePr>
+              <a:graphicFrameLocks noChangeAspect="1"/>
+            </wp:cNvGraphicFramePr>
+            <a:graphic>
+              <a:graphicData uri="http://schemas.openxmlformats.org/drawingml/2006/picture">
+                <pic:pic>
+                  <pic:nvPicPr>
+                    <pic:cNvPr id="0" name="crystal_0632_bands.png"/>
+                    <pic:cNvPicPr/>
+                  </pic:nvPicPr>
+                  <pic:blipFill>
+                    <a:blip r:embed="rId27"/>
+                    <a:stretch>
+                      <a:fillRect/>
+                    </a:stretch>
+                  </pic:blipFill>
+                  <pic:spPr>
+                    <a:xfrm>
+                      <a:off x="0" y="0"/>
+                      <a:ext cx="5029200" cy="3352800"/>
+                    </a:xfrm>
+                    <a:prstGeom prst="rect"/>
+                  </pic:spPr>
+                </pic:pic>
+              </a:graphicData>
+            </a:graphic>
+          </wp:inline>
+        </w:drawing>
+      </w:r>
+    </w:p>
+    <w:p>
+      <w:pPr>
+        <w:jc w:val="center"/>
+      </w:pPr>
       <w:r>
         <w:rPr>
           <w:rFonts w:ascii="Times New Roman" w:hAnsi="Times New Roman" w:eastAsia="Times New Roman"/>
           <w:b w:val="0"/>
           <w:i/>
-          <w:color w:val="FF0000"/>
-          <w:sz w:val="22"/>
+          <w:sz w:val="20"/>
         </w:rPr>
-        <w:t>[Image not found: D:\virtual-element-hybrid-crystals\paper\figures_png\crystal_0632_bands.png]</w:t>
+        <w:t>Band distribution plot for crystal_0632 (CrH</w:t>
+      </w:r>
+      <w:r>
+        <w:rPr>
+          <w:rFonts w:ascii="Times New Roman" w:hAnsi="Times New Roman" w:eastAsia="Times New Roman"/>
+          <w:b w:val="0"/>
+          <w:i/>
+          <w:sz w:val="20"/>
+          <w:vertAlign w:val="subscript"/>
+        </w:rPr>
+        <w:t>11</w:t>
+      </w:r>
+      <w:r>
+        <w:rPr>
+          <w:rFonts w:ascii="Times New Roman" w:hAnsi="Times New Roman" w:eastAsia="Times New Roman"/>
+          <w:b w:val="0"/>
+          <w:i/>
+          <w:sz w:val="20"/>
+        </w:rPr>
+        <w:t>C</w:t>
+      </w:r>
+      <w:r>
+        <w:rPr>
+          <w:rFonts w:ascii="Times New Roman" w:hAnsi="Times New Roman" w:eastAsia="Times New Roman"/>
+          <w:b w:val="0"/>
+          <w:i/>
+          <w:sz w:val="20"/>
+          <w:vertAlign w:val="subscript"/>
+        </w:rPr>
+        <w:t>2</w:t>
+      </w:r>
+      <w:r>
+        <w:rPr>
+          <w:rFonts w:ascii="Times New Roman" w:hAnsi="Times New Roman" w:eastAsia="Times New Roman"/>
+          <w:b w:val="0"/>
+          <w:i/>
+          <w:sz w:val="20"/>
+        </w:rPr>
+        <w:t>Br</w:t>
+      </w:r>
+      <w:r>
+        <w:rPr>
+          <w:rFonts w:ascii="Times New Roman" w:hAnsi="Times New Roman" w:eastAsia="Times New Roman"/>
+          <w:b w:val="0"/>
+          <w:i/>
+          <w:sz w:val="20"/>
+          <w:vertAlign w:val="subscript"/>
+        </w:rPr>
+        <w:t>6</w:t>
+      </w:r>
+      <w:r>
+        <w:rPr>
+          <w:rFonts w:ascii="Times New Roman" w:hAnsi="Times New Roman" w:eastAsia="Times New Roman"/>
+          <w:b w:val="0"/>
+          <w:i/>
+          <w:sz w:val="20"/>
+        </w:rPr>
+        <w:t>N</w:t>
+      </w:r>
+      <w:r>
+        <w:rPr>
+          <w:rFonts w:ascii="Times New Roman" w:hAnsi="Times New Roman" w:eastAsia="Times New Roman"/>
+          <w:b w:val="0"/>
+          <w:i/>
+          <w:sz w:val="20"/>
+          <w:vertAlign w:val="subscript"/>
+        </w:rPr>
+        <w:t>3</w:t>
+      </w:r>
+      <w:r>
+        <w:rPr>
+          <w:rFonts w:ascii="Times New Roman" w:hAnsi="Times New Roman" w:eastAsia="Times New Roman"/>
+          <w:b w:val="0"/>
+          <w:i/>
+          <w:sz w:val="20"/>
+        </w:rPr>
+        <w:t>). The VBM is at −2.279 eV (k-index 13) and the CBM is at −1.773 eV (k-index 11), yielding an indirect gap of 0.51 eV.</w:t>
       </w:r>
     </w:p>
+    <w:p/>
     <w:p>
       <w:pPr>
         <w:pStyle w:val="Heading3"/>
@@ -14530,17 +16544,135 @@
       </w:r>
     </w:p>
     <w:p>
+      <w:pPr>
+        <w:jc w:val="center"/>
+      </w:pPr>
+      <w:r>
+        <w:drawing>
+          <wp:inline xmlns:a="http://schemas.openxmlformats.org/drawingml/2006/main" xmlns:pic="http://schemas.openxmlformats.org/drawingml/2006/picture">
+            <wp:extent cx="5029200" cy="3017520"/>
+            <wp:docPr id="20" name="Picture 20"/>
+            <wp:cNvGraphicFramePr>
+              <a:graphicFrameLocks noChangeAspect="1"/>
+            </wp:cNvGraphicFramePr>
+            <a:graphic>
+              <a:graphicData uri="http://schemas.openxmlformats.org/drawingml/2006/picture">
+                <pic:pic>
+                  <pic:nvPicPr>
+                    <pic:cNvPr id="0" name="crystal_0632_dos.png"/>
+                    <pic:cNvPicPr/>
+                  </pic:nvPicPr>
+                  <pic:blipFill>
+                    <a:blip r:embed="rId28"/>
+                    <a:stretch>
+                      <a:fillRect/>
+                    </a:stretch>
+                  </pic:blipFill>
+                  <pic:spPr>
+                    <a:xfrm>
+                      <a:off x="0" y="0"/>
+                      <a:ext cx="5029200" cy="3017520"/>
+                    </a:xfrm>
+                    <a:prstGeom prst="rect"/>
+                  </pic:spPr>
+                </pic:pic>
+              </a:graphicData>
+            </a:graphic>
+          </wp:inline>
+        </w:drawing>
+      </w:r>
+    </w:p>
+    <w:p>
+      <w:pPr>
+        <w:jc w:val="center"/>
+      </w:pPr>
       <w:r>
         <w:rPr>
           <w:rFonts w:ascii="Times New Roman" w:hAnsi="Times New Roman" w:eastAsia="Times New Roman"/>
           <w:b w:val="0"/>
           <w:i/>
-          <w:color w:val="FF0000"/>
-          <w:sz w:val="22"/>
+          <w:sz w:val="20"/>
         </w:rPr>
-        <w:t>[Image not found: D:\virtual-element-hybrid-crystals\paper\figures_png\crystal_0632_dos.png]</w:t>
+        <w:t>Density of states (DOS) for crystal_0632 (CrH</w:t>
+      </w:r>
+      <w:r>
+        <w:rPr>
+          <w:rFonts w:ascii="Times New Roman" w:hAnsi="Times New Roman" w:eastAsia="Times New Roman"/>
+          <w:b w:val="0"/>
+          <w:i/>
+          <w:sz w:val="20"/>
+          <w:vertAlign w:val="subscript"/>
+        </w:rPr>
+        <w:t>11</w:t>
+      </w:r>
+      <w:r>
+        <w:rPr>
+          <w:rFonts w:ascii="Times New Roman" w:hAnsi="Times New Roman" w:eastAsia="Times New Roman"/>
+          <w:b w:val="0"/>
+          <w:i/>
+          <w:sz w:val="20"/>
+        </w:rPr>
+        <w:t>C</w:t>
+      </w:r>
+      <w:r>
+        <w:rPr>
+          <w:rFonts w:ascii="Times New Roman" w:hAnsi="Times New Roman" w:eastAsia="Times New Roman"/>
+          <w:b w:val="0"/>
+          <w:i/>
+          <w:sz w:val="20"/>
+          <w:vertAlign w:val="subscript"/>
+        </w:rPr>
+        <w:t>2</w:t>
+      </w:r>
+      <w:r>
+        <w:rPr>
+          <w:rFonts w:ascii="Times New Roman" w:hAnsi="Times New Roman" w:eastAsia="Times New Roman"/>
+          <w:b w:val="0"/>
+          <w:i/>
+          <w:sz w:val="20"/>
+        </w:rPr>
+        <w:t>Br</w:t>
+      </w:r>
+      <w:r>
+        <w:rPr>
+          <w:rFonts w:ascii="Times New Roman" w:hAnsi="Times New Roman" w:eastAsia="Times New Roman"/>
+          <w:b w:val="0"/>
+          <w:i/>
+          <w:sz w:val="20"/>
+          <w:vertAlign w:val="subscript"/>
+        </w:rPr>
+        <w:t>6</w:t>
+      </w:r>
+      <w:r>
+        <w:rPr>
+          <w:rFonts w:ascii="Times New Roman" w:hAnsi="Times New Roman" w:eastAsia="Times New Roman"/>
+          <w:b w:val="0"/>
+          <w:i/>
+          <w:sz w:val="20"/>
+        </w:rPr>
+        <w:t>N</w:t>
+      </w:r>
+      <w:r>
+        <w:rPr>
+          <w:rFonts w:ascii="Times New Roman" w:hAnsi="Times New Roman" w:eastAsia="Times New Roman"/>
+          <w:b w:val="0"/>
+          <w:i/>
+          <w:sz w:val="20"/>
+          <w:vertAlign w:val="subscript"/>
+        </w:rPr>
+        <w:t>3</w:t>
+      </w:r>
+      <w:r>
+        <w:rPr>
+          <w:rFonts w:ascii="Times New Roman" w:hAnsi="Times New Roman" w:eastAsia="Times New Roman"/>
+          <w:b w:val="0"/>
+          <w:i/>
+          <w:sz w:val="20"/>
+        </w:rPr>
+        <w:t>).</w:t>
       </w:r>
     </w:p>
+    <w:p/>
     <w:p>
       <w:pPr>
         <w:pStyle w:val="Heading2"/>
@@ -14841,7 +16973,7 @@
           <w:i w:val="0"/>
           <w:sz w:val="22"/>
         </w:rPr>
-        <w:t>paper_results/dft_inputs/</w:t>
+        <w:t>paper/dft_inputs/</w:t>
       </w:r>
     </w:p>
     <w:p>

</xml_diff>